<commit_message>
Atualiza a documentação em Word e a pasta de verificação com a seção Calor e internações
Novo fluxograma, seção 6 sobre os dados do SIH/SUS e a comparação com o esperado, módulos saude.py e interpretacao.py, testes novos. PDF e páginas de conferência refeitos (17 páginas).
</commit_message>
<xml_diff>
--- a/documentacao/Arquitetura_do_dashboard_Heliopolis.docx
+++ b/documentacao/Arquitetura_do_dashboard_Heliopolis.docx
@@ -17,7 +17,7 @@
     </w:p>
     <w:p>
       <w:r>
-        <w:t>Este documento explica a implementação atual do dashboard: como os dados são obtidos, tratados e utilizados; quais cálculos produzem cada gráfico; e como os arquivos Python se comunicam. O período analisado é 2021–2025, definido como os cinco anos completos anteriores a 2026.</w:t>
+        <w:t>Este documento explica a implementação atual do dashboard: como os dados de clima e de internações são obtidos, tratados e utilizados; quais cálculos produzem cada gráfico; e como os arquivos Python se comunicam. O período analisado é 2021–2025, definido como os cinco anos completos anteriores a 2026.</w:t>
       </w:r>
     </w:p>
     <w:p>
@@ -30,7 +30,7 @@
     </w:p>
     <w:p>
       <w:r>
-        <w:t>O projeto é uma aplicação monolítica modular em Python: a interface Streamlit, a coleta e as análises executam no mesmo processo, com responsabilidades separadas em arquivos. O navegador apresenta o painel e envia as interações; os módulos Python processam os dados com Pandas. A API REST consumida é externa, do Open-Meteo. O projeto não expõe uma API REST própria nem utiliza banco de dados.</w:t>
+        <w:t>O projeto é uma aplicação monolítica modular em Python: a interface Streamlit, a coleta e as análises executam no mesmo processo, com responsabilidades separadas em arquivos. O navegador apresenta o painel e envia as interações; os módulos Python processam os dados com Pandas. A API REST consumida é externa, do Open-Meteo. Os dados de saúde vêm de uma tabela local de internações do SIH/SUS, preparada fora do dashboard. O projeto não expõe uma API REST própria nem utiliza banco de dados.</w:t>
       </w:r>
     </w:p>
     <w:p>
@@ -595,6 +595,101 @@
               <w:rPr>
                 <w:sz w:val="19"/>
               </w:rPr>
+              <w:t>Comparar calor e internações</w:t>
+            </w:r>
+          </w:p>
+        </w:tc>
+        <w:tc>
+          <w:tcPr>
+            <w:tcW w:type="dxa" w:w="6633"/>
+            <w:vAlign w:val="center"/>
+            <w:tcBorders>
+              <w:top w:val="single" w:sz="4" w:color="D9D9D9"/>
+              <w:left w:val="single" w:sz="4" w:color="D9D9D9"/>
+              <w:bottom w:val="single" w:sz="4" w:color="D9D9D9"/>
+              <w:right w:val="single" w:sz="4" w:color="D9D9D9"/>
+            </w:tcBorders>
+            <w:shd w:fill="FFFFFF"/>
+            <w:tcMar>
+              <w:top w:w="90" w:type="dxa"/>
+              <w:left w:w="90" w:type="dxa"/>
+              <w:bottom w:w="90" w:type="dxa"/>
+              <w:right w:w="90" w:type="dxa"/>
+            </w:tcMar>
+          </w:tcPr>
+          <w:p>
+            <w:pPr>
+              <w:spacing w:after="40" w:line="252" w:lineRule="auto"/>
+            </w:pPr>
+            <w:r>
+              <w:rPr>
+                <w:sz w:val="19"/>
+              </w:rPr>
+              <w:t>Comparar as internações por doenças do coração e respiratórias nos dias quentes e em cada faixa de temperatura com o esperado, com intervalo de 95%.</w:t>
+            </w:r>
+          </w:p>
+        </w:tc>
+      </w:tr>
+      <w:tr>
+        <w:trPr>
+          <w:cantSplit/>
+        </w:trPr>
+        <w:tc>
+          <w:tcPr>
+            <w:tcW w:type="dxa" w:w="907"/>
+            <w:vAlign w:val="center"/>
+            <w:tcBorders>
+              <w:top w:val="single" w:sz="4" w:color="D9D9D9"/>
+              <w:left w:val="single" w:sz="4" w:color="D9D9D9"/>
+              <w:bottom w:val="single" w:sz="4" w:color="D9D9D9"/>
+              <w:right w:val="single" w:sz="4" w:color="D9D9D9"/>
+            </w:tcBorders>
+            <w:shd w:fill="F0F4F7"/>
+            <w:tcMar>
+              <w:top w:w="90" w:type="dxa"/>
+              <w:left w:w="90" w:type="dxa"/>
+              <w:bottom w:w="90" w:type="dxa"/>
+              <w:right w:w="90" w:type="dxa"/>
+            </w:tcMar>
+          </w:tcPr>
+          <w:p>
+            <w:pPr>
+              <w:spacing w:after="40" w:line="252" w:lineRule="auto"/>
+            </w:pPr>
+            <w:r>
+              <w:rPr>
+                <w:sz w:val="19"/>
+              </w:rPr>
+              <w:t>RF06</w:t>
+            </w:r>
+          </w:p>
+        </w:tc>
+        <w:tc>
+          <w:tcPr>
+            <w:tcW w:type="dxa" w:w="2098"/>
+            <w:vAlign w:val="center"/>
+            <w:tcBorders>
+              <w:top w:val="single" w:sz="4" w:color="D9D9D9"/>
+              <w:left w:val="single" w:sz="4" w:color="D9D9D9"/>
+              <w:bottom w:val="single" w:sz="4" w:color="D9D9D9"/>
+              <w:right w:val="single" w:sz="4" w:color="D9D9D9"/>
+            </w:tcBorders>
+            <w:shd w:fill="F0F4F7"/>
+            <w:tcMar>
+              <w:top w:w="90" w:type="dxa"/>
+              <w:left w:w="90" w:type="dxa"/>
+              <w:bottom w:w="90" w:type="dxa"/>
+              <w:right w:w="90" w:type="dxa"/>
+            </w:tcMar>
+          </w:tcPr>
+          <w:p>
+            <w:pPr>
+              <w:spacing w:after="40" w:line="252" w:lineRule="auto"/>
+            </w:pPr>
+            <w:r>
+              <w:rPr>
+                <w:sz w:val="19"/>
+              </w:rPr>
               <w:t>Apresentar resultados</w:t>
             </w:r>
           </w:p>
@@ -609,7 +704,7 @@
               <w:bottom w:val="single" w:sz="4" w:color="D9D9D9"/>
               <w:right w:val="single" w:sz="4" w:color="D9D9D9"/>
             </w:tcBorders>
-            <w:shd w:fill="FFFFFF"/>
+            <w:shd w:fill="F0F4F7"/>
             <w:tcMar>
               <w:top w:w="90" w:type="dxa"/>
               <w:left w:w="90" w:type="dxa"/>
@@ -1346,7 +1441,7 @@
     </w:p>
     <w:p>
       <w:r>
-        <w:t>Etapa futura do estudo: relacionar as condições regionais estimadas por ERA5 a dados de saúde e qualidade de vida compatíveis no tempo e no território. Esses desfechos ainda não estão integrados à aplicação.</w:t>
+        <w:t>Etapa atual do estudo: relacionar as condições regionais estimadas por ERA5 a dados de saúde. Já está integrada uma tabela de internações do SIH/SUS da cidade de São Paulo inteira (não do bairro). Dados de qualidade de vida e do próprio território de Heliópolis ainda não estão integrados à aplicação.</w:t>
       </w:r>
     </w:p>
     <w:p>
@@ -1382,7 +1477,7 @@
     </w:p>
     <w:p>
       <w:r>
-        <w:t>A aplicação consome a API REST do Open-Meteo ou lê o JSON dessa mesma fonte salvo localmente. As setas representam as trocas de dados e a sequência das responsabilidades; não representam microsserviços independentes.</w:t>
+        <w:t>A aplicação consome a API REST do Open-Meteo ou lê o JSON dessa mesma fonte salvo localmente. Os dados de saúde entram por uma tabela local, gerada por um pipeline offline que roda no terminal. As setas representam as trocas de dados e a sequência das responsabilidades; não representam microsserviços independentes.</w:t>
       </w:r>
     </w:p>
     <w:p>
@@ -1392,8 +1487,8 @@
       <w:r>
         <w:drawing>
           <wp:inline xmlns:a="http://schemas.openxmlformats.org/drawingml/2006/main" xmlns:pic="http://schemas.openxmlformats.org/drawingml/2006/picture">
-            <wp:extent cx="6120000" cy="4658000"/>
-            <wp:docPr id="1" name="Picture 1" descr="API externa recebe GET e retorna JSON ao módulo de extração. Arquivos locais também alimentam a extração. Transformação com Pandas e carga em memória alimentam análises e Streamlit, que troca interface e filtros com o navegador."/>
+            <wp:extent cx="6120000" cy="7106000"/>
+            <wp:docPr id="1" name="Picture 1" descr="API externa recebe GET e retorna JSON ao módulo de extração. Arquivos locais também alimentam a extração. Transformação com Pandas e carga em memória alimentam as análises de calor e o módulo de internações, que lê uma tabela local gerada por um pipeline offline com dados do DATASUS. O Streamlit troca interface e filtros com o navegador."/>
             <wp:cNvGraphicFramePr>
               <a:graphicFrameLocks noChangeAspect="1"/>
             </wp:cNvGraphicFramePr>
@@ -1413,7 +1508,7 @@
                   <pic:spPr>
                     <a:xfrm>
                       <a:off x="0" y="0"/>
-                      <a:ext cx="6120000" cy="4658000"/>
+                      <a:ext cx="6120000" cy="7106000"/>
                     </a:xfrm>
                     <a:prstGeom prst="rect"/>
                   </pic:spPr>
@@ -1429,17 +1524,17 @@
         <w:pStyle w:val="Caption"/>
       </w:pPr>
       <w:r>
-        <w:t>Figura de arquitetura  Requisições externas e ETL em memória na aplicação Python</w:t>
+        <w:t>Figura de arquitetura  Requisições externas, ETL em memória, tabela de internações e pipeline offline de saúde</w:t>
       </w:r>
     </w:p>
     <w:p>
       <w:r>
-        <w:t>Na carga inicial, o sistema prioriza o JSON salvo. Se ele não existir, o servidor Python envia uma requisição HTTPS GET ao endpoint /v1/archive do Open-Meteo, com coordenadas, período, modelo ERA5 e variáveis na URL; a resposta retorna em JSON. O Open-Meteo é a única fonte meteorológica consumida pela aplicação.</w:t>
+        <w:t>Na carga inicial, o sistema prioriza o JSON salvo. Se ele não existir, o servidor Python envia uma requisição HTTPS GET ao endpoint /v1/archive do Open-Meteo, com coordenadas, período, modelo ERA5 e variáveis na URL; a resposta retorna em JSON. O Open-Meteo é a única fonte meteorológica consumida pela aplicação. O dashboard não consulta o DATASUS: a tabela de internações é lida do disco.</w:t>
       </w:r>
     </w:p>
     <w:p>
       <w:r>
-        <w:t>O fluxo segue um ETL em memória: extrair o JSON local ou recebido da API; transformar campos, unidades, datas, cobertura e duplicatas; carregar DataFrames tratados para os cálculos e a visualização. A carga não ocorre em um data warehouse. Os scripts auxiliares geram arquivos persistentes quando executados; o dashboard reutiliza sessão e cache.</w:t>
+        <w:t>O fluxo segue um ETL em memória: extrair o JSON local ou recebido da API; transformar campos, unidades, datas, cobertura e duplicatas; carregar DataFrames tratados para os cálculos e a visualização. A carga não ocorre em um data warehouse. Os scripts auxiliares geram arquivos persistentes quando executados; o dashboard reutiliza sessão e cache. As internações seguem um caminho separado: scripts em exploracao_saude/ baixam o SIH/SUS, reduzem os arquivos a contagens e exportam dados_saude/internacoes_diarias_sp.csv.</w:t>
       </w:r>
     </w:p>
     <w:p>
@@ -1470,12 +1565,12 @@
     </w:p>
     <w:p>
       <w:r>
-        <w:t>O projeto utiliza Ciência de Dados para estudar as condições de calor relacionadas à saúde e à qualidade de vida dos moradores de Heliópolis. A etapa atual utiliza exclusivamente a série ERA5 disponibilizada pelo Open-Meteo; a investigação de associações com saúde e qualidade de vida depende da obtenção de desfechos compatíveis.</w:t>
+        <w:t>O projeto utiliza Ciência de Dados para estudar as condições de calor relacionadas à saúde e à qualidade de vida dos moradores de Heliópolis. A etapa atual combina a série ERA5 disponibilizada pelo Open-Meteo com uma tabela de internações hospitalares do SIH/SUS da cidade de São Paulo; a investigação de associações com qualidade de vida e com o território de Heliópolis depende de dados compatíveis ainda não obtidos.</w:t>
       </w:r>
     </w:p>
     <w:p>
       <w:r>
-        <w:t>Como não há medições dentro da comunidade nem desfechos de saúde ou qualidade de vida integrados, a versão documentada descreve condições regionais de calor. Ela não mede temperaturas dentro das moradias, sintomas, qualidade do sono ou impactos individuais.</w:t>
+        <w:t>Como não há medições dentro da comunidade e os dados de saúde cobrem a cidade inteira (apenas internações pelo SUS), a versão documentada descreve condições regionais de calor e as compara com as internações da cidade. Ela não mede temperaturas dentro das moradias, sintomas, qualidade do sono ou impactos individuais.</w:t>
       </w:r>
     </w:p>
     <w:p>
@@ -1503,7 +1598,7 @@
     </w:p>
     <w:p>
       <w:r>
-        <w:t>A série regional ajuda a explorar intensidade, frequência e persistência do calor. Para relacioná-la à experiência dos moradores, ainda serão necessários dados de saúde e qualidade de vida compatíveis no tempo e no território.</w:t>
+        <w:t>A série regional ajuda a explorar intensidade, frequência e persistência do calor. Para relacioná-la à experiência dos moradores de Heliópolis, ainda serão necessários dados de saúde e qualidade de vida compatíveis no tempo e no território do bairro.</w:t>
       </w:r>
     </w:p>
     <w:p>
@@ -1521,7 +1616,7 @@
     </w:p>
     <w:p>
       <w:r>
-        <w:t>O fluxo usa uma única fonte meteorológica: ERA5 pelo Open-Meteo. A mesma série pode ser obtida pela API ou por seu JSON salvo. Depois da validação e do recorte, ela alimenta todos os gráficos e indicadores.</w:t>
+        <w:t>O fluxo usa uma única fonte meteorológica: ERA5 pelo Open-Meteo. A mesma série pode ser obtida pela API ou por seu JSON salvo. Depois da validação e do recorte, ela alimenta todos os gráficos e indicadores. O módulo saude.py cruza os dias quentes com uma tabela local de internações, que não vem da internet em tempo de execução.</w:t>
       </w:r>
     </w:p>
     <w:p>
@@ -1531,8 +1626,8 @@
       <w:r>
         <w:drawing>
           <wp:inline xmlns:a="http://schemas.openxmlformats.org/drawingml/2006/main" xmlns:pic="http://schemas.openxmlformats.org/drawingml/2006/picture">
-            <wp:extent cx="6120000" cy="6256000"/>
-            <wp:docPr id="2" name="Picture 2" descr="Fluxograma da série ERA5 acessada pelo Open-Meteo, por sessão, JSON local ou API. Após validação, recorte e cálculo, os indicadores são apresentados no Streamlit."/>
+            <wp:extent cx="6120000" cy="7208000"/>
+            <wp:docPr id="2" name="Picture 2" descr="Fluxograma da série ERA5 acessada pelo Open-Meteo, por sessão, JSON local ou API. Após validação, recorte e cálculo, os indicadores seguem para o módulo de saúde, que também lê a tabela local de internações, e são apresentados no Streamlit."/>
             <wp:cNvGraphicFramePr>
               <a:graphicFrameLocks noChangeAspect="1"/>
             </wp:cNvGraphicFramePr>
@@ -1552,7 +1647,7 @@
                   <pic:spPr>
                     <a:xfrm>
                       <a:off x="0" y="0"/>
-                      <a:ext cx="6120000" cy="6256000"/>
+                      <a:ext cx="6120000" cy="7208000"/>
                     </a:xfrm>
                     <a:prstGeom prst="rect"/>
                   </pic:spPr>
@@ -1568,7 +1663,7 @@
         <w:pStyle w:val="Caption"/>
       </w:pPr>
       <w:r>
-        <w:t>Figura 1  Sequência implementada de entrada, tratamento, análise e apresentação dos dados</w:t>
+        <w:t>Figura 1  Sequência implementada de entrada, tratamento, análise, comparação com internações e apresentação dos dados</w:t>
       </w:r>
     </w:p>
     <w:p>
@@ -3628,7 +3723,1066 @@
         <w:pStyle w:val="Heading1"/>
       </w:pPr>
       <w:r>
-        <w:t>6 Responsabilidades dos arquivos principais</w:t>
+        <w:t>6 Calor e internações (SIH/SUS)</w:t>
+      </w:r>
+    </w:p>
+    <w:p>
+      <w:pPr>
+        <w:pStyle w:val="Heading2"/>
+      </w:pPr>
+      <w:r>
+        <w:t>De onde vêm os dados de saúde</w:t>
+      </w:r>
+    </w:p>
+    <w:p>
+      <w:r>
+        <w:t>As internações vêm do Sistema de Informações Hospitalares do SUS (SIH/SUS), arquivos AIH Reduzida (RD) de São Paulo, publicados pelo DATASUS. O dashboard não consulta o DATASUS: lê a tabela pronta dados_saude/internacoes_diarias_sp.csv, que foi gerada antes por um pipeline separado. Um arquivo .json ao lado dela registra a fonte, os filtros, a data de geração e o número de linhas.</w:t>
+      </w:r>
+    </w:p>
+    <w:tbl>
+      <w:tblPr>
+        <w:tblW w:type="auto" w:w="0"/>
+        <w:jc w:val="center"/>
+        <w:tblLayout w:type="fixed"/>
+        <w:tblLook w:firstColumn="1" w:firstRow="1" w:lastColumn="0" w:lastRow="0" w:noHBand="0" w:noVBand="1" w:val="04A0"/>
+      </w:tblPr>
+      <w:tblGrid>
+        <w:gridCol w:w="2268"/>
+        <w:gridCol w:w="7370"/>
+      </w:tblGrid>
+      <w:tr>
+        <w:trPr>
+          <w:tblHeader/>
+          <w:cantSplit/>
+        </w:trPr>
+        <w:tc>
+          <w:tcPr>
+            <w:tcW w:type="dxa" w:w="2268"/>
+            <w:vAlign w:val="center"/>
+            <w:tcBorders>
+              <w:top w:val="single" w:sz="4" w:color="D9D9D9"/>
+              <w:left w:val="single" w:sz="4" w:color="D9D9D9"/>
+              <w:bottom w:val="single" w:sz="4" w:color="D9D9D9"/>
+              <w:right w:val="single" w:sz="4" w:color="D9D9D9"/>
+            </w:tcBorders>
+            <w:shd w:fill="24475C"/>
+            <w:tcMar>
+              <w:top w:w="90" w:type="dxa"/>
+              <w:left w:w="90" w:type="dxa"/>
+              <w:bottom w:w="90" w:type="dxa"/>
+              <w:right w:w="90" w:type="dxa"/>
+            </w:tcMar>
+          </w:tcPr>
+          <w:p>
+            <w:pPr>
+              <w:spacing w:after="40" w:line="252" w:lineRule="auto"/>
+            </w:pPr>
+            <w:r>
+              <w:rPr>
+                <w:b/>
+                <w:color w:val="FFFFFF"/>
+                <w:sz w:val="19"/>
+              </w:rPr>
+              <w:t>Coluna da tabela</w:t>
+            </w:r>
+          </w:p>
+        </w:tc>
+        <w:tc>
+          <w:tcPr>
+            <w:tcW w:type="dxa" w:w="7370"/>
+            <w:vAlign w:val="center"/>
+            <w:tcBorders>
+              <w:top w:val="single" w:sz="4" w:color="D9D9D9"/>
+              <w:left w:val="single" w:sz="4" w:color="D9D9D9"/>
+              <w:bottom w:val="single" w:sz="4" w:color="D9D9D9"/>
+              <w:right w:val="single" w:sz="4" w:color="D9D9D9"/>
+            </w:tcBorders>
+            <w:shd w:fill="24475C"/>
+            <w:tcMar>
+              <w:top w:w="90" w:type="dxa"/>
+              <w:left w:w="90" w:type="dxa"/>
+              <w:bottom w:w="90" w:type="dxa"/>
+              <w:right w:w="90" w:type="dxa"/>
+            </w:tcMar>
+          </w:tcPr>
+          <w:p>
+            <w:pPr>
+              <w:spacing w:after="40" w:line="252" w:lineRule="auto"/>
+            </w:pPr>
+            <w:r>
+              <w:rPr>
+                <w:b/>
+                <w:color w:val="FFFFFF"/>
+                <w:sz w:val="19"/>
+              </w:rPr>
+              <w:t>Conteúdo</w:t>
+            </w:r>
+          </w:p>
+        </w:tc>
+      </w:tr>
+      <w:tr>
+        <w:trPr>
+          <w:cantSplit/>
+        </w:trPr>
+        <w:tc>
+          <w:tcPr>
+            <w:tcW w:type="dxa" w:w="2268"/>
+            <w:vAlign w:val="center"/>
+            <w:tcBorders>
+              <w:top w:val="single" w:sz="4" w:color="D9D9D9"/>
+              <w:left w:val="single" w:sz="4" w:color="D9D9D9"/>
+              <w:bottom w:val="single" w:sz="4" w:color="D9D9D9"/>
+              <w:right w:val="single" w:sz="4" w:color="D9D9D9"/>
+            </w:tcBorders>
+            <w:shd w:fill="FFFFFF"/>
+            <w:tcMar>
+              <w:top w:w="90" w:type="dxa"/>
+              <w:left w:w="90" w:type="dxa"/>
+              <w:bottom w:w="90" w:type="dxa"/>
+              <w:right w:w="90" w:type="dxa"/>
+            </w:tcMar>
+          </w:tcPr>
+          <w:p>
+            <w:pPr>
+              <w:spacing w:after="40" w:line="252" w:lineRule="auto"/>
+            </w:pPr>
+            <w:r>
+              <w:rPr>
+                <w:sz w:val="19"/>
+              </w:rPr>
+              <w:t>data</w:t>
+            </w:r>
+          </w:p>
+        </w:tc>
+        <w:tc>
+          <w:tcPr>
+            <w:tcW w:type="dxa" w:w="7370"/>
+            <w:vAlign w:val="center"/>
+            <w:tcBorders>
+              <w:top w:val="single" w:sz="4" w:color="D9D9D9"/>
+              <w:left w:val="single" w:sz="4" w:color="D9D9D9"/>
+              <w:bottom w:val="single" w:sz="4" w:color="D9D9D9"/>
+              <w:right w:val="single" w:sz="4" w:color="D9D9D9"/>
+            </w:tcBorders>
+            <w:shd w:fill="FFFFFF"/>
+            <w:tcMar>
+              <w:top w:w="90" w:type="dxa"/>
+              <w:left w:w="90" w:type="dxa"/>
+              <w:bottom w:w="90" w:type="dxa"/>
+              <w:right w:w="90" w:type="dxa"/>
+            </w:tcMar>
+          </w:tcPr>
+          <w:p>
+            <w:pPr>
+              <w:spacing w:after="40" w:line="252" w:lineRule="auto"/>
+            </w:pPr>
+            <w:r>
+              <w:rPr>
+                <w:sz w:val="19"/>
+              </w:rPr>
+              <w:t>Dia da internação, de 01/01/2021 a 31/12/2025</w:t>
+            </w:r>
+          </w:p>
+        </w:tc>
+      </w:tr>
+      <w:tr>
+        <w:trPr>
+          <w:cantSplit/>
+        </w:trPr>
+        <w:tc>
+          <w:tcPr>
+            <w:tcW w:type="dxa" w:w="2268"/>
+            <w:vAlign w:val="center"/>
+            <w:tcBorders>
+              <w:top w:val="single" w:sz="4" w:color="D9D9D9"/>
+              <w:left w:val="single" w:sz="4" w:color="D9D9D9"/>
+              <w:bottom w:val="single" w:sz="4" w:color="D9D9D9"/>
+              <w:right w:val="single" w:sz="4" w:color="D9D9D9"/>
+            </w:tcBorders>
+            <w:shd w:fill="F0F4F7"/>
+            <w:tcMar>
+              <w:top w:w="90" w:type="dxa"/>
+              <w:left w:w="90" w:type="dxa"/>
+              <w:bottom w:w="90" w:type="dxa"/>
+              <w:right w:w="90" w:type="dxa"/>
+            </w:tcMar>
+          </w:tcPr>
+          <w:p>
+            <w:pPr>
+              <w:spacing w:after="40" w:line="252" w:lineRule="auto"/>
+            </w:pPr>
+            <w:r>
+              <w:rPr>
+                <w:sz w:val="19"/>
+              </w:rPr>
+              <w:t>grupo_cid</w:t>
+            </w:r>
+          </w:p>
+        </w:tc>
+        <w:tc>
+          <w:tcPr>
+            <w:tcW w:type="dxa" w:w="7370"/>
+            <w:vAlign w:val="center"/>
+            <w:tcBorders>
+              <w:top w:val="single" w:sz="4" w:color="D9D9D9"/>
+              <w:left w:val="single" w:sz="4" w:color="D9D9D9"/>
+              <w:bottom w:val="single" w:sz="4" w:color="D9D9D9"/>
+              <w:right w:val="single" w:sz="4" w:color="D9D9D9"/>
+            </w:tcBorders>
+            <w:shd w:fill="F0F4F7"/>
+            <w:tcMar>
+              <w:top w:w="90" w:type="dxa"/>
+              <w:left w:w="90" w:type="dxa"/>
+              <w:bottom w:w="90" w:type="dxa"/>
+              <w:right w:w="90" w:type="dxa"/>
+            </w:tcMar>
+          </w:tcPr>
+          <w:p>
+            <w:pPr>
+              <w:spacing w:after="40" w:line="252" w:lineRule="auto"/>
+            </w:pPr>
+            <w:r>
+              <w:rPr>
+                <w:sz w:val="19"/>
+              </w:rPr>
+              <w:t>I00-I99 (aparelho circulatório) ou J00-J99 (aparelho respiratório)</w:t>
+            </w:r>
+          </w:p>
+        </w:tc>
+      </w:tr>
+      <w:tr>
+        <w:trPr>
+          <w:cantSplit/>
+        </w:trPr>
+        <w:tc>
+          <w:tcPr>
+            <w:tcW w:type="dxa" w:w="2268"/>
+            <w:vAlign w:val="center"/>
+            <w:tcBorders>
+              <w:top w:val="single" w:sz="4" w:color="D9D9D9"/>
+              <w:left w:val="single" w:sz="4" w:color="D9D9D9"/>
+              <w:bottom w:val="single" w:sz="4" w:color="D9D9D9"/>
+              <w:right w:val="single" w:sz="4" w:color="D9D9D9"/>
+            </w:tcBorders>
+            <w:shd w:fill="FFFFFF"/>
+            <w:tcMar>
+              <w:top w:w="90" w:type="dxa"/>
+              <w:left w:w="90" w:type="dxa"/>
+              <w:bottom w:w="90" w:type="dxa"/>
+              <w:right w:w="90" w:type="dxa"/>
+            </w:tcMar>
+          </w:tcPr>
+          <w:p>
+            <w:pPr>
+              <w:spacing w:after="40" w:line="252" w:lineRule="auto"/>
+            </w:pPr>
+            <w:r>
+              <w:rPr>
+                <w:sz w:val="19"/>
+              </w:rPr>
+              <w:t>faixa_etaria</w:t>
+            </w:r>
+          </w:p>
+        </w:tc>
+        <w:tc>
+          <w:tcPr>
+            <w:tcW w:type="dxa" w:w="7370"/>
+            <w:vAlign w:val="center"/>
+            <w:tcBorders>
+              <w:top w:val="single" w:sz="4" w:color="D9D9D9"/>
+              <w:left w:val="single" w:sz="4" w:color="D9D9D9"/>
+              <w:bottom w:val="single" w:sz="4" w:color="D9D9D9"/>
+              <w:right w:val="single" w:sz="4" w:color="D9D9D9"/>
+            </w:tcBorders>
+            <w:shd w:fill="FFFFFF"/>
+            <w:tcMar>
+              <w:top w:w="90" w:type="dxa"/>
+              <w:left w:w="90" w:type="dxa"/>
+              <w:bottom w:w="90" w:type="dxa"/>
+              <w:right w:w="90" w:type="dxa"/>
+            </w:tcMar>
+          </w:tcPr>
+          <w:p>
+            <w:pPr>
+              <w:spacing w:after="40" w:line="252" w:lineRule="auto"/>
+            </w:pPr>
+            <w:r>
+              <w:rPr>
+                <w:sz w:val="19"/>
+              </w:rPr>
+              <w:t>0-14, 15-64, 65+ ou sem idade</w:t>
+            </w:r>
+          </w:p>
+        </w:tc>
+      </w:tr>
+      <w:tr>
+        <w:trPr>
+          <w:cantSplit/>
+        </w:trPr>
+        <w:tc>
+          <w:tcPr>
+            <w:tcW w:type="dxa" w:w="2268"/>
+            <w:vAlign w:val="center"/>
+            <w:tcBorders>
+              <w:top w:val="single" w:sz="4" w:color="D9D9D9"/>
+              <w:left w:val="single" w:sz="4" w:color="D9D9D9"/>
+              <w:bottom w:val="single" w:sz="4" w:color="D9D9D9"/>
+              <w:right w:val="single" w:sz="4" w:color="D9D9D9"/>
+            </w:tcBorders>
+            <w:shd w:fill="F0F4F7"/>
+            <w:tcMar>
+              <w:top w:w="90" w:type="dxa"/>
+              <w:left w:w="90" w:type="dxa"/>
+              <w:bottom w:w="90" w:type="dxa"/>
+              <w:right w:w="90" w:type="dxa"/>
+            </w:tcMar>
+          </w:tcPr>
+          <w:p>
+            <w:pPr>
+              <w:spacing w:after="40" w:line="252" w:lineRule="auto"/>
+            </w:pPr>
+            <w:r>
+              <w:rPr>
+                <w:sz w:val="19"/>
+              </w:rPr>
+              <w:t>n_internacoes</w:t>
+            </w:r>
+          </w:p>
+        </w:tc>
+        <w:tc>
+          <w:tcPr>
+            <w:tcW w:type="dxa" w:w="7370"/>
+            <w:vAlign w:val="center"/>
+            <w:tcBorders>
+              <w:top w:val="single" w:sz="4" w:color="D9D9D9"/>
+              <w:left w:val="single" w:sz="4" w:color="D9D9D9"/>
+              <w:bottom w:val="single" w:sz="4" w:color="D9D9D9"/>
+              <w:right w:val="single" w:sz="4" w:color="D9D9D9"/>
+            </w:tcBorders>
+            <w:shd w:fill="F0F4F7"/>
+            <w:tcMar>
+              <w:top w:w="90" w:type="dxa"/>
+              <w:left w:w="90" w:type="dxa"/>
+              <w:bottom w:w="90" w:type="dxa"/>
+              <w:right w:w="90" w:type="dxa"/>
+            </w:tcMar>
+          </w:tcPr>
+          <w:p>
+            <w:pPr>
+              <w:spacing w:after="40" w:line="252" w:lineRule="auto"/>
+            </w:pPr>
+            <w:r>
+              <w:rPr>
+                <w:sz w:val="19"/>
+              </w:rPr>
+              <w:t>Número de internações naquele dia, grupo e faixa; dias sem internação aparecem com zero</w:t>
+            </w:r>
+          </w:p>
+        </w:tc>
+      </w:tr>
+    </w:tbl>
+    <w:p/>
+    <w:p>
+      <w:r>
+        <w:t>Entram apenas moradores da cidade de São Paulo (código IBGE 355030) com AIH normal. A tabela não contém CEP, idade exata, hospital nem qualquer dado individual. Ela descreve a cidade inteira e somente as internações pelo SUS; não identifica moradores de Heliópolis.</w:t>
+      </w:r>
+    </w:p>
+    <w:p>
+      <w:pPr>
+        <w:pStyle w:val="Heading2"/>
+      </w:pPr>
+      <w:r>
+        <w:t>Pipeline offline em exploracao_saude/</w:t>
+      </w:r>
+    </w:p>
+    <w:p>
+      <w:r>
+        <w:t>Os scripts da pasta exploracao_saude/ rodam no terminal, com ambiente próprio (Python 3.12 e PySUS), e não fazem parte da aplicação Streamlit. O catálogo do PySUS tem 52 dos 60 meses de 2021–2025; os 8 meses ausentes foram obtidos no FTP do DATASUS, em arquivos .dbc. Os arquivos de competências até 2026-08 foram usados para completar as internações de 2025, que chegam com atraso.</w:t>
+      </w:r>
+    </w:p>
+    <w:tbl>
+      <w:tblPr>
+        <w:tblW w:type="auto" w:w="0"/>
+        <w:jc w:val="center"/>
+        <w:tblLayout w:type="fixed"/>
+        <w:tblLook w:firstColumn="1" w:firstRow="1" w:lastColumn="0" w:lastRow="0" w:noHBand="0" w:noVBand="1" w:val="04A0"/>
+      </w:tblPr>
+      <w:tblGrid>
+        <w:gridCol w:w="1701"/>
+        <w:gridCol w:w="7937"/>
+      </w:tblGrid>
+      <w:tr>
+        <w:trPr>
+          <w:tblHeader/>
+          <w:cantSplit/>
+        </w:trPr>
+        <w:tc>
+          <w:tcPr>
+            <w:tcW w:type="dxa" w:w="1701"/>
+            <w:vAlign w:val="center"/>
+            <w:tcBorders>
+              <w:top w:val="single" w:sz="4" w:color="D9D9D9"/>
+              <w:left w:val="single" w:sz="4" w:color="D9D9D9"/>
+              <w:bottom w:val="single" w:sz="4" w:color="D9D9D9"/>
+              <w:right w:val="single" w:sz="4" w:color="D9D9D9"/>
+            </w:tcBorders>
+            <w:shd w:fill="24475C"/>
+            <w:tcMar>
+              <w:top w:w="90" w:type="dxa"/>
+              <w:left w:w="90" w:type="dxa"/>
+              <w:bottom w:w="90" w:type="dxa"/>
+              <w:right w:w="90" w:type="dxa"/>
+            </w:tcMar>
+          </w:tcPr>
+          <w:p>
+            <w:pPr>
+              <w:spacing w:after="40" w:line="252" w:lineRule="auto"/>
+            </w:pPr>
+            <w:r>
+              <w:rPr>
+                <w:b/>
+                <w:color w:val="FFFFFF"/>
+                <w:sz w:val="19"/>
+              </w:rPr>
+              <w:t>Script</w:t>
+            </w:r>
+          </w:p>
+        </w:tc>
+        <w:tc>
+          <w:tcPr>
+            <w:tcW w:type="dxa" w:w="7937"/>
+            <w:vAlign w:val="center"/>
+            <w:tcBorders>
+              <w:top w:val="single" w:sz="4" w:color="D9D9D9"/>
+              <w:left w:val="single" w:sz="4" w:color="D9D9D9"/>
+              <w:bottom w:val="single" w:sz="4" w:color="D9D9D9"/>
+              <w:right w:val="single" w:sz="4" w:color="D9D9D9"/>
+            </w:tcBorders>
+            <w:shd w:fill="24475C"/>
+            <w:tcMar>
+              <w:top w:w="90" w:type="dxa"/>
+              <w:left w:w="90" w:type="dxa"/>
+              <w:bottom w:w="90" w:type="dxa"/>
+              <w:right w:w="90" w:type="dxa"/>
+            </w:tcMar>
+          </w:tcPr>
+          <w:p>
+            <w:pPr>
+              <w:spacing w:after="40" w:line="252" w:lineRule="auto"/>
+            </w:pPr>
+            <w:r>
+              <w:rPr>
+                <w:b/>
+                <w:color w:val="FFFFFF"/>
+                <w:sz w:val="19"/>
+              </w:rPr>
+              <w:t>O que faz</w:t>
+            </w:r>
+          </w:p>
+        </w:tc>
+      </w:tr>
+      <w:tr>
+        <w:trPr>
+          <w:cantSplit/>
+        </w:trPr>
+        <w:tc>
+          <w:tcPr>
+            <w:tcW w:type="dxa" w:w="1701"/>
+            <w:vAlign w:val="center"/>
+            <w:tcBorders>
+              <w:top w:val="single" w:sz="4" w:color="D9D9D9"/>
+              <w:left w:val="single" w:sz="4" w:color="D9D9D9"/>
+              <w:bottom w:val="single" w:sz="4" w:color="D9D9D9"/>
+              <w:right w:val="single" w:sz="4" w:color="D9D9D9"/>
+            </w:tcBorders>
+            <w:shd w:fill="FFFFFF"/>
+            <w:tcMar>
+              <w:top w:w="90" w:type="dxa"/>
+              <w:left w:w="90" w:type="dxa"/>
+              <w:bottom w:w="90" w:type="dxa"/>
+              <w:right w:w="90" w:type="dxa"/>
+            </w:tcMar>
+          </w:tcPr>
+          <w:p>
+            <w:pPr>
+              <w:spacing w:after="40" w:line="252" w:lineRule="auto"/>
+            </w:pPr>
+            <w:r>
+              <w:rPr>
+                <w:sz w:val="19"/>
+              </w:rPr>
+              <w:t>01 e 01b</w:t>
+            </w:r>
+          </w:p>
+        </w:tc>
+        <w:tc>
+          <w:tcPr>
+            <w:tcW w:type="dxa" w:w="7937"/>
+            <w:vAlign w:val="center"/>
+            <w:tcBorders>
+              <w:top w:val="single" w:sz="4" w:color="D9D9D9"/>
+              <w:left w:val="single" w:sz="4" w:color="D9D9D9"/>
+              <w:bottom w:val="single" w:sz="4" w:color="D9D9D9"/>
+              <w:right w:val="single" w:sz="4" w:color="D9D9D9"/>
+            </w:tcBorders>
+            <w:shd w:fill="FFFFFF"/>
+            <w:tcMar>
+              <w:top w:w="90" w:type="dxa"/>
+              <w:left w:w="90" w:type="dxa"/>
+              <w:bottom w:w="90" w:type="dxa"/>
+              <w:right w:w="90" w:type="dxa"/>
+            </w:tcMar>
+          </w:tcPr>
+          <w:p>
+            <w:pPr>
+              <w:spacing w:after="40" w:line="252" w:lineRule="auto"/>
+            </w:pPr>
+            <w:r>
+              <w:rPr>
+                <w:sz w:val="19"/>
+              </w:rPr>
+              <w:t>Listam os arquivos disponíveis no catálogo do PySUS e no FTP</w:t>
+            </w:r>
+          </w:p>
+        </w:tc>
+      </w:tr>
+      <w:tr>
+        <w:trPr>
+          <w:cantSplit/>
+        </w:trPr>
+        <w:tc>
+          <w:tcPr>
+            <w:tcW w:type="dxa" w:w="1701"/>
+            <w:vAlign w:val="center"/>
+            <w:tcBorders>
+              <w:top w:val="single" w:sz="4" w:color="D9D9D9"/>
+              <w:left w:val="single" w:sz="4" w:color="D9D9D9"/>
+              <w:bottom w:val="single" w:sz="4" w:color="D9D9D9"/>
+              <w:right w:val="single" w:sz="4" w:color="D9D9D9"/>
+            </w:tcBorders>
+            <w:shd w:fill="F0F4F7"/>
+            <w:tcMar>
+              <w:top w:w="90" w:type="dxa"/>
+              <w:left w:w="90" w:type="dxa"/>
+              <w:bottom w:w="90" w:type="dxa"/>
+              <w:right w:w="90" w:type="dxa"/>
+            </w:tcMar>
+          </w:tcPr>
+          <w:p>
+            <w:pPr>
+              <w:spacing w:after="40" w:line="252" w:lineRule="auto"/>
+            </w:pPr>
+            <w:r>
+              <w:rPr>
+                <w:sz w:val="19"/>
+              </w:rPr>
+              <w:t>02 e 03</w:t>
+            </w:r>
+          </w:p>
+        </w:tc>
+        <w:tc>
+          <w:tcPr>
+            <w:tcW w:type="dxa" w:w="7937"/>
+            <w:vAlign w:val="center"/>
+            <w:tcBorders>
+              <w:top w:val="single" w:sz="4" w:color="D9D9D9"/>
+              <w:left w:val="single" w:sz="4" w:color="D9D9D9"/>
+              <w:bottom w:val="single" w:sz="4" w:color="D9D9D9"/>
+              <w:right w:val="single" w:sz="4" w:color="D9D9D9"/>
+            </w:tcBorders>
+            <w:shd w:fill="F0F4F7"/>
+            <w:tcMar>
+              <w:top w:w="90" w:type="dxa"/>
+              <w:left w:w="90" w:type="dxa"/>
+              <w:bottom w:w="90" w:type="dxa"/>
+              <w:right w:w="90" w:type="dxa"/>
+            </w:tcMar>
+          </w:tcPr>
+          <w:p>
+            <w:pPr>
+              <w:spacing w:after="40" w:line="252" w:lineRule="auto"/>
+            </w:pPr>
+            <w:r>
+              <w:rPr>
+                <w:sz w:val="19"/>
+              </w:rPr>
+              <w:t>Exploram um mês: colunas, perfil e contagem diária</w:t>
+            </w:r>
+          </w:p>
+        </w:tc>
+      </w:tr>
+      <w:tr>
+        <w:trPr>
+          <w:cantSplit/>
+        </w:trPr>
+        <w:tc>
+          <w:tcPr>
+            <w:tcW w:type="dxa" w:w="1701"/>
+            <w:vAlign w:val="center"/>
+            <w:tcBorders>
+              <w:top w:val="single" w:sz="4" w:color="D9D9D9"/>
+              <w:left w:val="single" w:sz="4" w:color="D9D9D9"/>
+              <w:bottom w:val="single" w:sz="4" w:color="D9D9D9"/>
+              <w:right w:val="single" w:sz="4" w:color="D9D9D9"/>
+            </w:tcBorders>
+            <w:shd w:fill="FFFFFF"/>
+            <w:tcMar>
+              <w:top w:w="90" w:type="dxa"/>
+              <w:left w:w="90" w:type="dxa"/>
+              <w:bottom w:w="90" w:type="dxa"/>
+              <w:right w:w="90" w:type="dxa"/>
+            </w:tcMar>
+          </w:tcPr>
+          <w:p>
+            <w:pPr>
+              <w:spacing w:after="40" w:line="252" w:lineRule="auto"/>
+            </w:pPr>
+            <w:r>
+              <w:rPr>
+                <w:sz w:val="19"/>
+              </w:rPr>
+              <w:t>04 e 05</w:t>
+            </w:r>
+          </w:p>
+        </w:tc>
+        <w:tc>
+          <w:tcPr>
+            <w:tcW w:type="dxa" w:w="7937"/>
+            <w:vAlign w:val="center"/>
+            <w:tcBorders>
+              <w:top w:val="single" w:sz="4" w:color="D9D9D9"/>
+              <w:left w:val="single" w:sz="4" w:color="D9D9D9"/>
+              <w:bottom w:val="single" w:sz="4" w:color="D9D9D9"/>
+              <w:right w:val="single" w:sz="4" w:color="D9D9D9"/>
+            </w:tcBorders>
+            <w:shd w:fill="FFFFFF"/>
+            <w:tcMar>
+              <w:top w:w="90" w:type="dxa"/>
+              <w:left w:w="90" w:type="dxa"/>
+              <w:bottom w:w="90" w:type="dxa"/>
+              <w:right w:w="90" w:type="dxa"/>
+            </w:tcMar>
+          </w:tcPr>
+          <w:p>
+            <w:pPr>
+              <w:spacing w:after="40" w:line="252" w:lineRule="auto"/>
+            </w:pPr>
+            <w:r>
+              <w:rPr>
+                <w:sz w:val="19"/>
+              </w:rPr>
+              <w:t>Baixam mês a mês, reduzem cada arquivo a contagens, apagam o arquivo bruto e montam as contagens mensal e diária</w:t>
+            </w:r>
+          </w:p>
+        </w:tc>
+      </w:tr>
+      <w:tr>
+        <w:trPr>
+          <w:cantSplit/>
+        </w:trPr>
+        <w:tc>
+          <w:tcPr>
+            <w:tcW w:type="dxa" w:w="1701"/>
+            <w:vAlign w:val="center"/>
+            <w:tcBorders>
+              <w:top w:val="single" w:sz="4" w:color="D9D9D9"/>
+              <w:left w:val="single" w:sz="4" w:color="D9D9D9"/>
+              <w:bottom w:val="single" w:sz="4" w:color="D9D9D9"/>
+              <w:right w:val="single" w:sz="4" w:color="D9D9D9"/>
+            </w:tcBorders>
+            <w:shd w:fill="F0F4F7"/>
+            <w:tcMar>
+              <w:top w:w="90" w:type="dxa"/>
+              <w:left w:w="90" w:type="dxa"/>
+              <w:bottom w:w="90" w:type="dxa"/>
+              <w:right w:w="90" w:type="dxa"/>
+            </w:tcMar>
+          </w:tcPr>
+          <w:p>
+            <w:pPr>
+              <w:spacing w:after="40" w:line="252" w:lineRule="auto"/>
+            </w:pPr>
+            <w:r>
+              <w:rPr>
+                <w:sz w:val="19"/>
+              </w:rPr>
+              <w:t>06 e 08</w:t>
+            </w:r>
+          </w:p>
+        </w:tc>
+        <w:tc>
+          <w:tcPr>
+            <w:tcW w:type="dxa" w:w="7937"/>
+            <w:vAlign w:val="center"/>
+            <w:tcBorders>
+              <w:top w:val="single" w:sz="4" w:color="D9D9D9"/>
+              <w:left w:val="single" w:sz="4" w:color="D9D9D9"/>
+              <w:bottom w:val="single" w:sz="4" w:color="D9D9D9"/>
+              <w:right w:val="single" w:sz="4" w:color="D9D9D9"/>
+            </w:tcBorders>
+            <w:shd w:fill="F0F4F7"/>
+            <w:tcMar>
+              <w:top w:w="90" w:type="dxa"/>
+              <w:left w:w="90" w:type="dxa"/>
+              <w:bottom w:w="90" w:type="dxa"/>
+              <w:right w:w="90" w:type="dxa"/>
+            </w:tcMar>
+          </w:tcPr>
+          <w:p>
+            <w:pPr>
+              <w:spacing w:after="40" w:line="252" w:lineRule="auto"/>
+            </w:pPr>
+            <w:r>
+              <w:rPr>
+                <w:sz w:val="19"/>
+              </w:rPr>
+              <w:t>Cruzam as internações com a temperatura e conferem o método do painel com regressão de Poisson, em vários limiares</w:t>
+            </w:r>
+          </w:p>
+        </w:tc>
+      </w:tr>
+      <w:tr>
+        <w:trPr>
+          <w:cantSplit/>
+        </w:trPr>
+        <w:tc>
+          <w:tcPr>
+            <w:tcW w:type="dxa" w:w="1701"/>
+            <w:vAlign w:val="center"/>
+            <w:tcBorders>
+              <w:top w:val="single" w:sz="4" w:color="D9D9D9"/>
+              <w:left w:val="single" w:sz="4" w:color="D9D9D9"/>
+              <w:bottom w:val="single" w:sz="4" w:color="D9D9D9"/>
+              <w:right w:val="single" w:sz="4" w:color="D9D9D9"/>
+            </w:tcBorders>
+            <w:shd w:fill="FFFFFF"/>
+            <w:tcMar>
+              <w:top w:w="90" w:type="dxa"/>
+              <w:left w:w="90" w:type="dxa"/>
+              <w:bottom w:w="90" w:type="dxa"/>
+              <w:right w:w="90" w:type="dxa"/>
+            </w:tcMar>
+          </w:tcPr>
+          <w:p>
+            <w:pPr>
+              <w:spacing w:after="40" w:line="252" w:lineRule="auto"/>
+            </w:pPr>
+            <w:r>
+              <w:rPr>
+                <w:sz w:val="19"/>
+              </w:rPr>
+              <w:t>07</w:t>
+            </w:r>
+          </w:p>
+        </w:tc>
+        <w:tc>
+          <w:tcPr>
+            <w:tcW w:type="dxa" w:w="7937"/>
+            <w:vAlign w:val="center"/>
+            <w:tcBorders>
+              <w:top w:val="single" w:sz="4" w:color="D9D9D9"/>
+              <w:left w:val="single" w:sz="4" w:color="D9D9D9"/>
+              <w:bottom w:val="single" w:sz="4" w:color="D9D9D9"/>
+              <w:right w:val="single" w:sz="4" w:color="D9D9D9"/>
+            </w:tcBorders>
+            <w:shd w:fill="FFFFFF"/>
+            <w:tcMar>
+              <w:top w:w="90" w:type="dxa"/>
+              <w:left w:w="90" w:type="dxa"/>
+              <w:bottom w:w="90" w:type="dxa"/>
+              <w:right w:w="90" w:type="dxa"/>
+            </w:tcMar>
+          </w:tcPr>
+          <w:p>
+            <w:pPr>
+              <w:spacing w:after="40" w:line="252" w:lineRule="auto"/>
+            </w:pPr>
+            <w:r>
+              <w:rPr>
+                <w:sz w:val="19"/>
+              </w:rPr>
+              <w:t>Exporta a tabela dados_saude/internacoes_diarias_sp.csv que o dashboard lê</w:t>
+            </w:r>
+          </w:p>
+        </w:tc>
+      </w:tr>
+    </w:tbl>
+    <w:p/>
+    <w:p>
+      <w:r>
+        <w:t>O relatório exploracao_saude/RELATORIO.md resume o que foi feito e conclui que os dados do SIH permitem uma série diária da cidade, mas não chegam ao bairro de Heliópolis.</w:t>
+      </w:r>
+    </w:p>
+    <w:p>
+      <w:pPr>
+        <w:pStyle w:val="Heading2"/>
+      </w:pPr>
+      <w:r>
+        <w:t>Como a comparação é calculada</w:t>
+      </w:r>
+    </w:p>
+    <w:p>
+      <w:r>
+        <w:t>Dias de calor e dias comuns diferem também por mês do ano, ano e dia da semana, que afetam as internações independentemente do clima. Para reduzir esse efeito, cada dia quente é comparado com o valor esperado: a média das internações dos dias não quentes do mesmo ano, mês e dia da semana. Os dias quentes ficam fora dessa média. Um dia quente só entra se houver pelo menos dois dias de referência.</w:t>
+      </w:r>
+    </w:p>
+    <w:p>
+      <w:pPr>
+        <w:jc w:val="center"/>
+      </w:pPr>
+      <m:oMath>
+        <m:r>
+          <m:t>Diferença (%) = 100 × (internações reais / internações esperadas nos dias quentes − 1)</m:t>
+        </m:r>
+      </m:oMath>
+    </w:p>
+    <w:p>
+      <w:r>
+        <w:t>O intervalo de 95% vem de sortear, com reposição, os dias quentes 2.000 vezes (reamostragem). Se o intervalo inclui o zero, o painel não mostra diferença clara. Com menos de 10 dias quentes ou menos de 10 dias de comparação, o resultado não é calculado e a tela orienta o usuário.</w:t>
+      </w:r>
+    </w:p>
+    <w:tbl>
+      <w:tblPr>
+        <w:tblW w:type="auto" w:w="0"/>
+        <w:jc w:val="center"/>
+        <w:tblLayout w:type="fixed"/>
+        <w:tblLook w:firstColumn="1" w:firstRow="1" w:lastColumn="0" w:lastRow="0" w:noHBand="0" w:noVBand="1" w:val="04A0"/>
+      </w:tblPr>
+      <w:tblGrid>
+        <w:gridCol w:w="3118"/>
+        <w:gridCol w:w="6520"/>
+      </w:tblGrid>
+      <w:tr>
+        <w:trPr>
+          <w:tblHeader/>
+          <w:cantSplit/>
+        </w:trPr>
+        <w:tc>
+          <w:tcPr>
+            <w:tcW w:type="dxa" w:w="3118"/>
+            <w:vAlign w:val="center"/>
+            <w:tcBorders>
+              <w:top w:val="single" w:sz="4" w:color="D9D9D9"/>
+              <w:left w:val="single" w:sz="4" w:color="D9D9D9"/>
+              <w:bottom w:val="single" w:sz="4" w:color="D9D9D9"/>
+              <w:right w:val="single" w:sz="4" w:color="D9D9D9"/>
+            </w:tcBorders>
+            <w:shd w:fill="24475C"/>
+            <w:tcMar>
+              <w:top w:w="90" w:type="dxa"/>
+              <w:left w:w="90" w:type="dxa"/>
+              <w:bottom w:w="90" w:type="dxa"/>
+              <w:right w:w="90" w:type="dxa"/>
+            </w:tcMar>
+          </w:tcPr>
+          <w:p>
+            <w:pPr>
+              <w:spacing w:after="40" w:line="252" w:lineRule="auto"/>
+            </w:pPr>
+            <w:r>
+              <w:rPr>
+                <w:b/>
+                <w:color w:val="FFFFFF"/>
+                <w:sz w:val="19"/>
+              </w:rPr>
+              <w:t>Gráfico da seção</w:t>
+            </w:r>
+          </w:p>
+        </w:tc>
+        <w:tc>
+          <w:tcPr>
+            <w:tcW w:type="dxa" w:w="6520"/>
+            <w:vAlign w:val="center"/>
+            <w:tcBorders>
+              <w:top w:val="single" w:sz="4" w:color="D9D9D9"/>
+              <w:left w:val="single" w:sz="4" w:color="D9D9D9"/>
+              <w:bottom w:val="single" w:sz="4" w:color="D9D9D9"/>
+              <w:right w:val="single" w:sz="4" w:color="D9D9D9"/>
+            </w:tcBorders>
+            <w:shd w:fill="24475C"/>
+            <w:tcMar>
+              <w:top w:w="90" w:type="dxa"/>
+              <w:left w:w="90" w:type="dxa"/>
+              <w:bottom w:w="90" w:type="dxa"/>
+              <w:right w:w="90" w:type="dxa"/>
+            </w:tcMar>
+          </w:tcPr>
+          <w:p>
+            <w:pPr>
+              <w:spacing w:after="40" w:line="252" w:lineRule="auto"/>
+            </w:pPr>
+            <w:r>
+              <w:rPr>
+                <w:b/>
+                <w:color w:val="FFFFFF"/>
+                <w:sz w:val="19"/>
+              </w:rPr>
+              <w:t>O que compara</w:t>
+            </w:r>
+          </w:p>
+        </w:tc>
+      </w:tr>
+      <w:tr>
+        <w:trPr>
+          <w:cantSplit/>
+        </w:trPr>
+        <w:tc>
+          <w:tcPr>
+            <w:tcW w:type="dxa" w:w="3118"/>
+            <w:vAlign w:val="center"/>
+            <w:tcBorders>
+              <w:top w:val="single" w:sz="4" w:color="D9D9D9"/>
+              <w:left w:val="single" w:sz="4" w:color="D9D9D9"/>
+              <w:bottom w:val="single" w:sz="4" w:color="D9D9D9"/>
+              <w:right w:val="single" w:sz="4" w:color="D9D9D9"/>
+            </w:tcBorders>
+            <w:shd w:fill="FFFFFF"/>
+            <w:tcMar>
+              <w:top w:w="90" w:type="dxa"/>
+              <w:left w:w="90" w:type="dxa"/>
+              <w:bottom w:w="90" w:type="dxa"/>
+              <w:right w:w="90" w:type="dxa"/>
+            </w:tcMar>
+          </w:tcPr>
+          <w:p>
+            <w:pPr>
+              <w:spacing w:after="40" w:line="252" w:lineRule="auto"/>
+            </w:pPr>
+            <w:r>
+              <w:rPr>
+                <w:sz w:val="19"/>
+              </w:rPr>
+              <w:t>Internações nos dias quentes</w:t>
+            </w:r>
+          </w:p>
+        </w:tc>
+        <w:tc>
+          <w:tcPr>
+            <w:tcW w:type="dxa" w:w="6520"/>
+            <w:vAlign w:val="center"/>
+            <w:tcBorders>
+              <w:top w:val="single" w:sz="4" w:color="D9D9D9"/>
+              <w:left w:val="single" w:sz="4" w:color="D9D9D9"/>
+              <w:bottom w:val="single" w:sz="4" w:color="D9D9D9"/>
+              <w:right w:val="single" w:sz="4" w:color="D9D9D9"/>
+            </w:tcBorders>
+            <w:shd w:fill="FFFFFF"/>
+            <w:tcMar>
+              <w:top w:w="90" w:type="dxa"/>
+              <w:left w:w="90" w:type="dxa"/>
+              <w:bottom w:w="90" w:type="dxa"/>
+              <w:right w:w="90" w:type="dxa"/>
+            </w:tcMar>
+          </w:tcPr>
+          <w:p>
+            <w:pPr>
+              <w:spacing w:after="40" w:line="252" w:lineRule="auto"/>
+            </w:pPr>
+            <w:r>
+              <w:rPr>
+                <w:sz w:val="19"/>
+              </w:rPr>
+              <w:t>Dias com máxima ≥ limiar do painel, por grupo de doença e por idade (todas as idades e 65 anos ou mais)</w:t>
+            </w:r>
+          </w:p>
+        </w:tc>
+      </w:tr>
+      <w:tr>
+        <w:trPr>
+          <w:cantSplit/>
+        </w:trPr>
+        <w:tc>
+          <w:tcPr>
+            <w:tcW w:type="dxa" w:w="3118"/>
+            <w:vAlign w:val="center"/>
+            <w:tcBorders>
+              <w:top w:val="single" w:sz="4" w:color="D9D9D9"/>
+              <w:left w:val="single" w:sz="4" w:color="D9D9D9"/>
+              <w:bottom w:val="single" w:sz="4" w:color="D9D9D9"/>
+              <w:right w:val="single" w:sz="4" w:color="D9D9D9"/>
+            </w:tcBorders>
+            <w:shd w:fill="F0F4F7"/>
+            <w:tcMar>
+              <w:top w:w="90" w:type="dxa"/>
+              <w:left w:w="90" w:type="dxa"/>
+              <w:bottom w:w="90" w:type="dxa"/>
+              <w:right w:w="90" w:type="dxa"/>
+            </w:tcMar>
+          </w:tcPr>
+          <w:p>
+            <w:pPr>
+              <w:spacing w:after="40" w:line="252" w:lineRule="auto"/>
+            </w:pPr>
+            <w:r>
+              <w:rPr>
+                <w:sz w:val="19"/>
+              </w:rPr>
+              <w:t>Internações por faixa de temperatura</w:t>
+            </w:r>
+          </w:p>
+        </w:tc>
+        <w:tc>
+          <w:tcPr>
+            <w:tcW w:type="dxa" w:w="6520"/>
+            <w:vAlign w:val="center"/>
+            <w:tcBorders>
+              <w:top w:val="single" w:sz="4" w:color="D9D9D9"/>
+              <w:left w:val="single" w:sz="4" w:color="D9D9D9"/>
+              <w:bottom w:val="single" w:sz="4" w:color="D9D9D9"/>
+              <w:right w:val="single" w:sz="4" w:color="D9D9D9"/>
+            </w:tcBorders>
+            <w:shd w:fill="F0F4F7"/>
+            <w:tcMar>
+              <w:top w:w="90" w:type="dxa"/>
+              <w:left w:w="90" w:type="dxa"/>
+              <w:bottom w:w="90" w:type="dxa"/>
+              <w:right w:w="90" w:type="dxa"/>
+            </w:tcMar>
+          </w:tcPr>
+          <w:p>
+            <w:pPr>
+              <w:spacing w:after="40" w:line="252" w:lineRule="auto"/>
+            </w:pPr>
+            <w:r>
+              <w:rPr>
+                <w:sz w:val="19"/>
+              </w:rPr>
+              <w:t>Cada faixa de temperatura máxima (abaixo de 20, 20 a 24, 24 a 27, 27 a 30 e 30 °C ou mais) contra os dias fora da faixa, para todas as idades; não depende do limiar</w:t>
+            </w:r>
+          </w:p>
+        </w:tc>
+      </w:tr>
+    </w:tbl>
+    <w:p/>
+    <w:p>
+      <w:r>
+        <w:t>Os gráficos de barras desta seção usam Altair, instalado junto com o Streamlit, para deixar os nomes do eixo na horizontal. saude.py faz as contas e interpretacao.py escreve as leituras em linguagem simples (leitura_saude e leitura_faixas), sem desenhar gráficos.</w:t>
+      </w:r>
+    </w:p>
+    <w:p>
+      <w:pPr>
+        <w:pStyle w:val="Heading2"/>
+      </w:pPr>
+      <w:r>
+        <w:t>Limites de interpretação</w:t>
+      </w:r>
+    </w:p>
+    <w:p>
+      <w:r>
+        <w:t>É uma comparação descritiva e mostra associação, não causa. Os dados são da cidade inteira e só do SUS, enquanto o calor é uma estimativa regional. Diferenças pequenas podem ser acaso, e faixas muito frias ou muito quentes têm menos dias e resultados mais incertos. O texto da tela traz esses avisos junto de cada resultado.</w:t>
+      </w:r>
+    </w:p>
+    <w:p>
+      <w:r>
+        <w:br w:type="page"/>
+      </w:r>
+    </w:p>
+    <w:p>
+      <w:pPr>
+        <w:pStyle w:val="Heading1"/>
+      </w:pPr>
+      <w:r>
+        <w:t>7 Responsabilidades dos arquivos principais</w:t>
       </w:r>
     </w:p>
     <w:p>
@@ -3646,7 +4800,7 @@
     </w:p>
     <w:p>
       <w:r>
-        <w:t>painel.py coordena a aplicação. iniciar_base obtém a base; recortar_base aplica o ano selecionado; main chama indicadores_diarios, indicadores_noturnos e episodios_quentes. mostrar_exposicao desenha os cartões e gráficos de evolução e frequência; mostrar_rotina apresenta horário, noite e umidade; mostrar_persistencia exibe os episódios.</w:t>
+        <w:t>painel.py coordena a aplicação. iniciar_base obtém a base; recortar_base aplica o ano selecionado; main chama indicadores_diarios, indicadores_noturnos e episodios_quentes. mostrar_exposicao desenha os cartões e gráficos de evolução e frequência; mostrar_rotina apresenta horário, noite e umidade; mostrar_persistencia exibe os episódios; mostrar_saude desenha a seção Calor e internações, com barras_agrupadas (Altair) para os dois gráficos de barras.</w:t>
       </w:r>
     </w:p>
     <w:p>
@@ -4089,6 +5243,24 @@
       </w:r>
     </w:p>
     <w:p>
+      <w:pPr>
+        <w:pStyle w:val="Heading2"/>
+      </w:pPr>
+      <w:r>
+        <w:t>saude.py e interpretacao.py</w:t>
+      </w:r>
+    </w:p>
+    <w:p>
+      <w:r>
+        <w:t>saude.py lê a tabela de internações (carregar_internacoes), escolhe grupo de doença e idade (serie_diaria) e compara os dias quentes e cada faixa de temperatura com o esperado (comparar_todos e comparar_por_faixas). Recebe a tabela diária de analise.py e não desenha gráficos nem escreve textos.</w:t>
+      </w:r>
+    </w:p>
+    <w:p>
+      <w:r>
+        <w:t>interpretacao.py reúne os textos explicativos do dashboard: fontes, glossário, conclusões e as leituras automáticas que citam os números do recorte, como leitura_saude e leitura_faixas. Não faz contas estatísticas.</w:t>
+      </w:r>
+    </w:p>
+    <w:p>
       <w:r>
         <w:br w:type="page"/>
       </w:r>
@@ -4098,7 +5270,7 @@
         <w:pStyle w:val="Heading1"/>
       </w:pPr>
       <w:r>
-        <w:t>7 Comunicação execução e persistência</w:t>
+        <w:t>8 Comunicação execução e persistência</w:t>
       </w:r>
     </w:p>
     <w:p>
@@ -4152,7 +5324,7 @@
     </w:p>
     <w:p>
       <w:r>
-        <w:t>O ano altera todas as análises. O limiar altera a classificação dos dias, frequência anual e episódios. Ele não altera as temperaturas nem filtra os gráficos de evolução, perfil horário, noite e dispersão.</w:t>
+        <w:t>O ano altera todas as análises. O limiar altera a classificação dos dias, frequência anual e episódios. Ele também define quais dias entram na comparação com internações nos dias quentes, mas não altera as temperaturas, os gráficos de evolução, perfil horário, noite e dispersão, nem o gráfico por faixa de temperatura.</w:t>
       </w:r>
     </w:p>
     <w:p>
@@ -4170,7 +5342,7 @@
     </w:p>
     <w:p>
       <w:r>
-        <w:t>A comunicação usa funções importadas, DataFrames, dicionários e datas. Não existe uma API interna. O caminho principal é app → painel → dados e analise. painel também importa textos de arquitetura_projeto e a formatação de apoio. gerar_relatorio chama dados e analise sem iniciar Streamlit.</w:t>
+        <w:t>A comunicação usa funções importadas, DataFrames, dicionários e datas. Não existe uma API interna. O caminho principal é app → painel → dados e analise; para a seção de saúde, painel chama saude e interpretacao, e saude recebe a tabela diária de analise. painel também importa textos de arquitetura_projeto e a formatação de apoio. gerar_relatorio chama dados e analise sem iniciar Streamlit.</w:t>
       </w:r>
     </w:p>
     <w:p>
@@ -4183,7 +5355,7 @@
         <w:pStyle w:val="Heading1"/>
       </w:pPr>
       <w:r>
-        <w:t>8 Armazenamento testes e limites de interpretação</w:t>
+        <w:t>9 Armazenamento testes e limites de interpretação</w:t>
       </w:r>
     </w:p>
     <w:tbl>
@@ -4427,6 +5599,136 @@
               <w:rPr>
                 <w:sz w:val="19"/>
               </w:rPr>
+              <w:t>dados_saude/</w:t>
+            </w:r>
+          </w:p>
+        </w:tc>
+        <w:tc>
+          <w:tcPr>
+            <w:tcW w:type="dxa" w:w="5669"/>
+            <w:vAlign w:val="center"/>
+            <w:tcBorders>
+              <w:top w:val="single" w:sz="4" w:color="D9D9D9"/>
+              <w:left w:val="single" w:sz="4" w:color="D9D9D9"/>
+              <w:bottom w:val="single" w:sz="4" w:color="D9D9D9"/>
+              <w:right w:val="single" w:sz="4" w:color="D9D9D9"/>
+            </w:tcBorders>
+            <w:shd w:fill="FFFFFF"/>
+            <w:tcMar>
+              <w:top w:w="90" w:type="dxa"/>
+              <w:left w:w="90" w:type="dxa"/>
+              <w:bottom w:w="90" w:type="dxa"/>
+              <w:right w:w="90" w:type="dxa"/>
+            </w:tcMar>
+          </w:tcPr>
+          <w:p>
+            <w:pPr>
+              <w:spacing w:after="40" w:line="252" w:lineRule="auto"/>
+            </w:pPr>
+            <w:r>
+              <w:rPr>
+                <w:sz w:val="19"/>
+              </w:rPr>
+              <w:t>Tabela diária de internações do SIH/SUS (CSV) e arquivo .json com a origem; é lida pelo painel</w:t>
+            </w:r>
+          </w:p>
+        </w:tc>
+      </w:tr>
+      <w:tr>
+        <w:trPr>
+          <w:cantSplit/>
+        </w:trPr>
+        <w:tc>
+          <w:tcPr>
+            <w:tcW w:type="dxa" w:w="3969"/>
+            <w:vAlign w:val="center"/>
+            <w:tcBorders>
+              <w:top w:val="single" w:sz="4" w:color="D9D9D9"/>
+              <w:left w:val="single" w:sz="4" w:color="D9D9D9"/>
+              <w:bottom w:val="single" w:sz="4" w:color="D9D9D9"/>
+              <w:right w:val="single" w:sz="4" w:color="D9D9D9"/>
+            </w:tcBorders>
+            <w:shd w:fill="F0F4F7"/>
+            <w:tcMar>
+              <w:top w:w="90" w:type="dxa"/>
+              <w:left w:w="90" w:type="dxa"/>
+              <w:bottom w:w="90" w:type="dxa"/>
+              <w:right w:w="90" w:type="dxa"/>
+            </w:tcMar>
+          </w:tcPr>
+          <w:p>
+            <w:pPr>
+              <w:spacing w:after="40" w:line="252" w:lineRule="auto"/>
+            </w:pPr>
+            <w:r>
+              <w:rPr>
+                <w:sz w:val="19"/>
+              </w:rPr>
+              <w:t>exploracao_saude/</w:t>
+            </w:r>
+          </w:p>
+        </w:tc>
+        <w:tc>
+          <w:tcPr>
+            <w:tcW w:type="dxa" w:w="5669"/>
+            <w:vAlign w:val="center"/>
+            <w:tcBorders>
+              <w:top w:val="single" w:sz="4" w:color="D9D9D9"/>
+              <w:left w:val="single" w:sz="4" w:color="D9D9D9"/>
+              <w:bottom w:val="single" w:sz="4" w:color="D9D9D9"/>
+              <w:right w:val="single" w:sz="4" w:color="D9D9D9"/>
+            </w:tcBorders>
+            <w:shd w:fill="F0F4F7"/>
+            <w:tcMar>
+              <w:top w:w="90" w:type="dxa"/>
+              <w:left w:w="90" w:type="dxa"/>
+              <w:bottom w:w="90" w:type="dxa"/>
+              <w:right w:w="90" w:type="dxa"/>
+            </w:tcMar>
+          </w:tcPr>
+          <w:p>
+            <w:pPr>
+              <w:spacing w:after="40" w:line="252" w:lineRule="auto"/>
+            </w:pPr>
+            <w:r>
+              <w:rPr>
+                <w:sz w:val="19"/>
+              </w:rPr>
+              <w:t>Scripts, saídas e relatório do pipeline offline que gera a tabela de saúde; fora do dashboard</w:t>
+            </w:r>
+          </w:p>
+        </w:tc>
+      </w:tr>
+      <w:tr>
+        <w:trPr>
+          <w:cantSplit/>
+        </w:trPr>
+        <w:tc>
+          <w:tcPr>
+            <w:tcW w:type="dxa" w:w="3969"/>
+            <w:vAlign w:val="center"/>
+            <w:tcBorders>
+              <w:top w:val="single" w:sz="4" w:color="D9D9D9"/>
+              <w:left w:val="single" w:sz="4" w:color="D9D9D9"/>
+              <w:bottom w:val="single" w:sz="4" w:color="D9D9D9"/>
+              <w:right w:val="single" w:sz="4" w:color="D9D9D9"/>
+            </w:tcBorders>
+            <w:shd w:fill="FFFFFF"/>
+            <w:tcMar>
+              <w:top w:w="90" w:type="dxa"/>
+              <w:left w:w="90" w:type="dxa"/>
+              <w:bottom w:w="90" w:type="dxa"/>
+              <w:right w:w="90" w:type="dxa"/>
+            </w:tcMar>
+          </w:tcPr>
+          <w:p>
+            <w:pPr>
+              <w:spacing w:after="40" w:line="252" w:lineRule="auto"/>
+            </w:pPr>
+            <w:r>
+              <w:rPr>
+                <w:sz w:val="19"/>
+              </w:rPr>
               <w:t>requirements.txt</w:t>
             </w:r>
           </w:p>
@@ -4596,7 +5898,7 @@
     <w:p/>
     <w:p>
       <w:r>
-        <w:t>O dashboard lê o JSON ERA5 ou consulta a API quando ele não existe, recalculando os resultados. Os CSVs diários exportados são saídas auxiliares e não alimentam o painel. Imagens do dashboard servem para conferência visual e não alimentam a análise.</w:t>
+        <w:t>O dashboard lê o JSON ERA5 ou consulta a API quando ele não existe, recalculando os resultados. Os CSVs diários exportados pelo terminal são saídas auxiliares e não alimentam o painel; a tabela de internações em dados_saude/ é a exceção, porque o painel a lê. Imagens do dashboard servem para conferência visual e não alimentam a análise.</w:t>
       </w:r>
     </w:p>
     <w:p>
@@ -4818,6 +6120,136 @@
           </w:p>
         </w:tc>
       </w:tr>
+      <w:tr>
+        <w:trPr>
+          <w:cantSplit/>
+        </w:trPr>
+        <w:tc>
+          <w:tcPr>
+            <w:tcW w:type="dxa" w:w="3969"/>
+            <w:vAlign w:val="center"/>
+            <w:tcBorders>
+              <w:top w:val="single" w:sz="4" w:color="D9D9D9"/>
+              <w:left w:val="single" w:sz="4" w:color="D9D9D9"/>
+              <w:bottom w:val="single" w:sz="4" w:color="D9D9D9"/>
+              <w:right w:val="single" w:sz="4" w:color="D9D9D9"/>
+            </w:tcBorders>
+            <w:shd w:fill="FFFFFF"/>
+            <w:tcMar>
+              <w:top w:w="90" w:type="dxa"/>
+              <w:left w:w="90" w:type="dxa"/>
+              <w:bottom w:w="90" w:type="dxa"/>
+              <w:right w:w="90" w:type="dxa"/>
+            </w:tcMar>
+          </w:tcPr>
+          <w:p>
+            <w:pPr>
+              <w:spacing w:after="40" w:line="252" w:lineRule="auto"/>
+            </w:pPr>
+            <w:r>
+              <w:rPr>
+                <w:sz w:val="19"/>
+              </w:rPr>
+              <w:t>test_saude.py</w:t>
+            </w:r>
+          </w:p>
+        </w:tc>
+        <w:tc>
+          <w:tcPr>
+            <w:tcW w:type="dxa" w:w="5669"/>
+            <w:vAlign w:val="center"/>
+            <w:tcBorders>
+              <w:top w:val="single" w:sz="4" w:color="D9D9D9"/>
+              <w:left w:val="single" w:sz="4" w:color="D9D9D9"/>
+              <w:bottom w:val="single" w:sz="4" w:color="D9D9D9"/>
+              <w:right w:val="single" w:sz="4" w:color="D9D9D9"/>
+            </w:tcBorders>
+            <w:shd w:fill="FFFFFF"/>
+            <w:tcMar>
+              <w:top w:w="90" w:type="dxa"/>
+              <w:left w:w="90" w:type="dxa"/>
+              <w:bottom w:w="90" w:type="dxa"/>
+              <w:right w:w="90" w:type="dxa"/>
+            </w:tcMar>
+          </w:tcPr>
+          <w:p>
+            <w:pPr>
+              <w:spacing w:after="40" w:line="252" w:lineRule="auto"/>
+            </w:pPr>
+            <w:r>
+              <w:rPr>
+                <w:sz w:val="19"/>
+              </w:rPr>
+              <w:t>Comparação com o esperado, intervalo, dias inválidos, faixas de temperatura, tabela sem dados pessoais e seção no painel</w:t>
+            </w:r>
+          </w:p>
+        </w:tc>
+      </w:tr>
+      <w:tr>
+        <w:trPr>
+          <w:cantSplit/>
+        </w:trPr>
+        <w:tc>
+          <w:tcPr>
+            <w:tcW w:type="dxa" w:w="3969"/>
+            <w:vAlign w:val="center"/>
+            <w:tcBorders>
+              <w:top w:val="single" w:sz="4" w:color="D9D9D9"/>
+              <w:left w:val="single" w:sz="4" w:color="D9D9D9"/>
+              <w:bottom w:val="single" w:sz="4" w:color="D9D9D9"/>
+              <w:right w:val="single" w:sz="4" w:color="D9D9D9"/>
+            </w:tcBorders>
+            <w:shd w:fill="F0F4F7"/>
+            <w:tcMar>
+              <w:top w:w="90" w:type="dxa"/>
+              <w:left w:w="90" w:type="dxa"/>
+              <w:bottom w:w="90" w:type="dxa"/>
+              <w:right w:w="90" w:type="dxa"/>
+            </w:tcMar>
+          </w:tcPr>
+          <w:p>
+            <w:pPr>
+              <w:spacing w:after="40" w:line="252" w:lineRule="auto"/>
+            </w:pPr>
+            <w:r>
+              <w:rPr>
+                <w:sz w:val="19"/>
+              </w:rPr>
+              <w:t>test_interpretacao.py</w:t>
+            </w:r>
+          </w:p>
+        </w:tc>
+        <w:tc>
+          <w:tcPr>
+            <w:tcW w:type="dxa" w:w="5669"/>
+            <w:vAlign w:val="center"/>
+            <w:tcBorders>
+              <w:top w:val="single" w:sz="4" w:color="D9D9D9"/>
+              <w:left w:val="single" w:sz="4" w:color="D9D9D9"/>
+              <w:bottom w:val="single" w:sz="4" w:color="D9D9D9"/>
+              <w:right w:val="single" w:sz="4" w:color="D9D9D9"/>
+            </w:tcBorders>
+            <w:shd w:fill="F0F4F7"/>
+            <w:tcMar>
+              <w:top w:w="90" w:type="dxa"/>
+              <w:left w:w="90" w:type="dxa"/>
+              <w:bottom w:w="90" w:type="dxa"/>
+              <w:right w:w="90" w:type="dxa"/>
+            </w:tcMar>
+          </w:tcPr>
+          <w:p>
+            <w:pPr>
+              <w:spacing w:after="40" w:line="252" w:lineRule="auto"/>
+            </w:pPr>
+            <w:r>
+              <w:rPr>
+                <w:sz w:val="19"/>
+              </w:rPr>
+              <w:t>Textos dinâmicos, perfil horário, correlação, glossário e conclusões</w:t>
+            </w:r>
+          </w:p>
+        </w:tc>
+      </w:tr>
     </w:tbl>
     <w:p/>
     <w:p>
@@ -4845,7 +6277,7 @@
     </w:p>
     <w:p>
       <w:r>
-        <w:t>Para cumprir integralmente o objetivo de impactos na saúde e qualidade de vida, será necessário integrar desfechos compatíveis com a exposição ambiental estimada no tempo e no território, com definições e cobertura conhecidas. Essa etapa exige novos dados e regras analíticas, não apenas novos gráficos.</w:t>
+        <w:t>A seção de internações mostra associação entre calor regional e internações da cidade inteira pelo SUS; não identifica efeito no bairro nem causa. Para cumprir integralmente o objetivo de impactos na saúde e na qualidade de vida em Heliópolis, será necessário integrar desfechos compatíveis com a exposição ambiental estimada no tempo e no território do bairro, com definições e cobertura conhecidas. Essa etapa exige novos dados e regras analíticas, não apenas novos gráficos.</w:t>
       </w:r>
     </w:p>
     <w:p>
@@ -4858,12 +6290,12 @@
         <w:pStyle w:val="Heading1"/>
       </w:pPr>
       <w:r>
-        <w:t>9 Fontes e rastreabilidade da documentação</w:t>
+        <w:t>10 Fontes e rastreabilidade da documentação</w:t>
       </w:r>
     </w:p>
     <w:p>
       <w:r>
-        <w:t>A descrição dos módulos e cálculos foi conferida no código local vigente em 19 de outubro de 2026. As referências externas abaixo fundamentam a explicação do ERA5 e de sua disponibilização pelo Open-Meteo. Elas não substituem a verificação dos parâmetros efetivamente usados pelo projeto.</w:t>
+        <w:t>A descrição dos módulos e cálculos foi conferida no código local vigente em 24 de outubro de 2026. As referências externas abaixo fundamentam a explicação do ERA5 e de sua disponibilização pelo Open-Meteo. Elas não substituem a verificação dos parâmetros efetivamente usados pelo projeto.</w:t>
       </w:r>
     </w:p>
     <w:p>
@@ -5108,7 +6540,7 @@
               <w:rPr>
                 <w:sz w:val="19"/>
               </w:rPr>
-              <w:t>iniciar_base, recortar_base, mostrar_exposicao, mostrar_rotina, mostrar_persistencia, main</w:t>
+              <w:t>iniciar_base, recortar_base, mostrar_exposicao, mostrar_rotina, mostrar_persistencia, mostrar_saude, barras_agrupadas, main</w:t>
             </w:r>
           </w:p>
         </w:tc>
@@ -5273,6 +6705,136 @@
               <w:rPr>
                 <w:sz w:val="19"/>
               </w:rPr>
+              <w:t>saude.py</w:t>
+            </w:r>
+          </w:p>
+        </w:tc>
+        <w:tc>
+          <w:tcPr>
+            <w:tcW w:type="dxa" w:w="6690"/>
+            <w:vAlign w:val="center"/>
+            <w:tcBorders>
+              <w:top w:val="single" w:sz="4" w:color="D9D9D9"/>
+              <w:left w:val="single" w:sz="4" w:color="D9D9D9"/>
+              <w:bottom w:val="single" w:sz="4" w:color="D9D9D9"/>
+              <w:right w:val="single" w:sz="4" w:color="D9D9D9"/>
+            </w:tcBorders>
+            <w:shd w:fill="FFFFFF"/>
+            <w:tcMar>
+              <w:top w:w="90" w:type="dxa"/>
+              <w:left w:w="90" w:type="dxa"/>
+              <w:bottom w:w="90" w:type="dxa"/>
+              <w:right w:w="90" w:type="dxa"/>
+            </w:tcMar>
+          </w:tcPr>
+          <w:p>
+            <w:pPr>
+              <w:spacing w:after="40" w:line="252" w:lineRule="auto"/>
+            </w:pPr>
+            <w:r>
+              <w:rPr>
+                <w:sz w:val="19"/>
+              </w:rPr>
+              <w:t>carregar_internacoes, serie_diaria, comparar_dias_quentes, comparar_por_faixas, comparar_todos</w:t>
+            </w:r>
+          </w:p>
+        </w:tc>
+      </w:tr>
+      <w:tr>
+        <w:trPr>
+          <w:cantSplit/>
+        </w:trPr>
+        <w:tc>
+          <w:tcPr>
+            <w:tcW w:type="dxa" w:w="2948"/>
+            <w:vAlign w:val="center"/>
+            <w:tcBorders>
+              <w:top w:val="single" w:sz="4" w:color="D9D9D9"/>
+              <w:left w:val="single" w:sz="4" w:color="D9D9D9"/>
+              <w:bottom w:val="single" w:sz="4" w:color="D9D9D9"/>
+              <w:right w:val="single" w:sz="4" w:color="D9D9D9"/>
+            </w:tcBorders>
+            <w:shd w:fill="F0F4F7"/>
+            <w:tcMar>
+              <w:top w:w="90" w:type="dxa"/>
+              <w:left w:w="90" w:type="dxa"/>
+              <w:bottom w:w="90" w:type="dxa"/>
+              <w:right w:w="90" w:type="dxa"/>
+            </w:tcMar>
+          </w:tcPr>
+          <w:p>
+            <w:pPr>
+              <w:spacing w:after="40" w:line="252" w:lineRule="auto"/>
+            </w:pPr>
+            <w:r>
+              <w:rPr>
+                <w:sz w:val="19"/>
+              </w:rPr>
+              <w:t>interpretacao.py</w:t>
+            </w:r>
+          </w:p>
+        </w:tc>
+        <w:tc>
+          <w:tcPr>
+            <w:tcW w:type="dxa" w:w="6690"/>
+            <w:vAlign w:val="center"/>
+            <w:tcBorders>
+              <w:top w:val="single" w:sz="4" w:color="D9D9D9"/>
+              <w:left w:val="single" w:sz="4" w:color="D9D9D9"/>
+              <w:bottom w:val="single" w:sz="4" w:color="D9D9D9"/>
+              <w:right w:val="single" w:sz="4" w:color="D9D9D9"/>
+            </w:tcBorders>
+            <w:shd w:fill="F0F4F7"/>
+            <w:tcMar>
+              <w:top w:w="90" w:type="dxa"/>
+              <w:left w:w="90" w:type="dxa"/>
+              <w:bottom w:w="90" w:type="dxa"/>
+              <w:right w:w="90" w:type="dxa"/>
+            </w:tcMar>
+          </w:tcPr>
+          <w:p>
+            <w:pPr>
+              <w:spacing w:after="40" w:line="252" w:lineRule="auto"/>
+            </w:pPr>
+            <w:r>
+              <w:rPr>
+                <w:sz w:val="19"/>
+              </w:rPr>
+              <w:t>leitura_saude, leitura_faixas, conclusoes e os textos fixos da página</w:t>
+            </w:r>
+          </w:p>
+        </w:tc>
+      </w:tr>
+      <w:tr>
+        <w:trPr>
+          <w:cantSplit/>
+        </w:trPr>
+        <w:tc>
+          <w:tcPr>
+            <w:tcW w:type="dxa" w:w="2948"/>
+            <w:vAlign w:val="center"/>
+            <w:tcBorders>
+              <w:top w:val="single" w:sz="4" w:color="D9D9D9"/>
+              <w:left w:val="single" w:sz="4" w:color="D9D9D9"/>
+              <w:bottom w:val="single" w:sz="4" w:color="D9D9D9"/>
+              <w:right w:val="single" w:sz="4" w:color="D9D9D9"/>
+            </w:tcBorders>
+            <w:shd w:fill="FFFFFF"/>
+            <w:tcMar>
+              <w:top w:w="90" w:type="dxa"/>
+              <w:left w:w="90" w:type="dxa"/>
+              <w:bottom w:w="90" w:type="dxa"/>
+              <w:right w:w="90" w:type="dxa"/>
+            </w:tcMar>
+          </w:tcPr>
+          <w:p>
+            <w:pPr>
+              <w:spacing w:after="40" w:line="252" w:lineRule="auto"/>
+            </w:pPr>
+            <w:r>
+              <w:rPr>
+                <w:sz w:val="19"/>
+              </w:rPr>
               <w:t>apoio.py e gerar_relatorio.py</w:t>
             </w:r>
           </w:p>
@@ -5338,7 +6900,7 @@
       <w:rPr>
         <w:sz w:val="16"/>
       </w:rPr>
-      <w:t xml:space="preserve">Versão de 19 outubro 2026  •  Página </w:t>
+      <w:t xml:space="preserve">Versão de 24 outubro 2026  •  Página </w:t>
     </w:r>
     <w:fldSimple w:instr="PAGE"/>
   </w:p>

</xml_diff>

<commit_message>
Corrige inconsistências entre o código e a documentação
- Pearson: o texto da dispersão passa a dizer que há correlação (mínimo de 30 dias) e que ela não indica causa.
- Perfil horário: calculado em analise.perfil_horario; só as médias mensais ficam no painel.
- Listas de funções de analise.py e painel.py completas, com o papel de cada função do painel.
- Slider: LIMIAR_MUDA e LIMIAR_NAO_MUDA citam os dois gráficos de internações; teste atualizado.
- Removido o parágrafo de limites repetido na seção de arquitetura.
- Limites estatísticos da comparação de internações na tela e no documento.
- Documento, PDF e páginas de conferência regenerados (18 páginas).
</commit_message>
<xml_diff>
--- a/documentacao/Arquitetura_do_dashboard_Heliopolis.docx
+++ b/documentacao/Arquitetura_do_dashboard_Heliopolis.docx
@@ -1539,11 +1539,6 @@
     </w:p>
     <w:p>
       <w:r>
-        <w:t>Os requisitos acima descrevem o comportamento atual, não uma certificação de qualidade. A execução é local; autenticação, controle de acesso para dados pessoais e operação pública com alta disponibilidade não foram implementados.</w:t>
-      </w:r>
-    </w:p>
-    <w:p>
-      <w:r>
         <w:br w:type="page"/>
       </w:r>
     </w:p>
@@ -2910,7 +2905,7 @@
     </w:p>
     <w:p>
       <w:r>
-        <w:t>O eixo horizontal recebe a temperatura média diária; o vertical recebe a umidade média diária. Todos os dias elegíveis aparecem, inclusive aqueles abaixo do limiar. Não há cálculo de Pearson, regressão, sensação térmica, UTCI ou índice fisiológico nessa visualização.</w:t>
+        <w:t>O eixo horizontal recebe a temperatura média diária; o vertical recebe a umidade média diária. Todos os dias elegíveis aparecem, inclusive aqueles abaixo do limiar. O painel resume a relação entre as duas medidas com o coeficiente de correlação de Pearson (correlacao_calor_umidade, em analise.py), mostrado em texto por frase_correlacao, em interpretacao.py, e apenas quando há pelo menos 30 dias válidos. Não há regressão, sensação térmica, UTCI nem índice fisiológico nessa visualização, e a correlação descreve um padrão, não indica causa.</w:t>
       </w:r>
     </w:p>
     <w:p>
@@ -4774,6 +4769,354 @@
     </w:p>
     <w:p>
       <w:r>
+        <w:t>Há também limites do próprio cálculo estatístico, que o painel avisa na caixa "Limites desta comparação":</w:t>
+      </w:r>
+    </w:p>
+    <w:tbl>
+      <w:tblPr>
+        <w:tblW w:type="auto" w:w="0"/>
+        <w:jc w:val="center"/>
+        <w:tblLayout w:type="fixed"/>
+        <w:tblLook w:firstColumn="1" w:firstRow="1" w:lastColumn="0" w:lastRow="0" w:noHBand="0" w:noVBand="1" w:val="04A0"/>
+      </w:tblPr>
+      <w:tblGrid>
+        <w:gridCol w:w="2551"/>
+        <w:gridCol w:w="7087"/>
+      </w:tblGrid>
+      <w:tr>
+        <w:trPr>
+          <w:tblHeader/>
+          <w:cantSplit/>
+        </w:trPr>
+        <w:tc>
+          <w:tcPr>
+            <w:tcW w:type="dxa" w:w="2551"/>
+            <w:vAlign w:val="center"/>
+            <w:tcBorders>
+              <w:top w:val="single" w:sz="4" w:color="D9D9D9"/>
+              <w:left w:val="single" w:sz="4" w:color="D9D9D9"/>
+              <w:bottom w:val="single" w:sz="4" w:color="D9D9D9"/>
+              <w:right w:val="single" w:sz="4" w:color="D9D9D9"/>
+            </w:tcBorders>
+            <w:shd w:fill="24475C"/>
+            <w:tcMar>
+              <w:top w:w="90" w:type="dxa"/>
+              <w:left w:w="90" w:type="dxa"/>
+              <w:bottom w:w="90" w:type="dxa"/>
+              <w:right w:w="90" w:type="dxa"/>
+            </w:tcMar>
+          </w:tcPr>
+          <w:p>
+            <w:pPr>
+              <w:spacing w:after="40" w:line="252" w:lineRule="auto"/>
+            </w:pPr>
+            <w:r>
+              <w:rPr>
+                <w:b/>
+                <w:color w:val="FFFFFF"/>
+                <w:sz w:val="19"/>
+              </w:rPr>
+              <w:t>Limite</w:t>
+            </w:r>
+          </w:p>
+        </w:tc>
+        <w:tc>
+          <w:tcPr>
+            <w:tcW w:type="dxa" w:w="7087"/>
+            <w:vAlign w:val="center"/>
+            <w:tcBorders>
+              <w:top w:val="single" w:sz="4" w:color="D9D9D9"/>
+              <w:left w:val="single" w:sz="4" w:color="D9D9D9"/>
+              <w:bottom w:val="single" w:sz="4" w:color="D9D9D9"/>
+              <w:right w:val="single" w:sz="4" w:color="D9D9D9"/>
+            </w:tcBorders>
+            <w:shd w:fill="24475C"/>
+            <w:tcMar>
+              <w:top w:w="90" w:type="dxa"/>
+              <w:left w:w="90" w:type="dxa"/>
+              <w:bottom w:w="90" w:type="dxa"/>
+              <w:right w:w="90" w:type="dxa"/>
+            </w:tcMar>
+          </w:tcPr>
+          <w:p>
+            <w:pPr>
+              <w:spacing w:after="40" w:line="252" w:lineRule="auto"/>
+            </w:pPr>
+            <w:r>
+              <w:rPr>
+                <w:b/>
+                <w:color w:val="FFFFFF"/>
+                <w:sz w:val="19"/>
+              </w:rPr>
+              <w:t>O que significa</w:t>
+            </w:r>
+          </w:p>
+        </w:tc>
+      </w:tr>
+      <w:tr>
+        <w:trPr>
+          <w:cantSplit/>
+        </w:trPr>
+        <w:tc>
+          <w:tcPr>
+            <w:tcW w:type="dxa" w:w="2551"/>
+            <w:vAlign w:val="center"/>
+            <w:tcBorders>
+              <w:top w:val="single" w:sz="4" w:color="D9D9D9"/>
+              <w:left w:val="single" w:sz="4" w:color="D9D9D9"/>
+              <w:bottom w:val="single" w:sz="4" w:color="D9D9D9"/>
+              <w:right w:val="single" w:sz="4" w:color="D9D9D9"/>
+            </w:tcBorders>
+            <w:shd w:fill="FFFFFF"/>
+            <w:tcMar>
+              <w:top w:w="90" w:type="dxa"/>
+              <w:left w:w="90" w:type="dxa"/>
+              <w:bottom w:w="90" w:type="dxa"/>
+              <w:right w:w="90" w:type="dxa"/>
+            </w:tcMar>
+          </w:tcPr>
+          <w:p>
+            <w:pPr>
+              <w:spacing w:after="40" w:line="252" w:lineRule="auto"/>
+            </w:pPr>
+            <w:r>
+              <w:rPr>
+                <w:sz w:val="19"/>
+              </w:rPr>
+              <w:t>Dias quentes em sequência</w:t>
+            </w:r>
+          </w:p>
+        </w:tc>
+        <w:tc>
+          <w:tcPr>
+            <w:tcW w:type="dxa" w:w="7087"/>
+            <w:vAlign w:val="center"/>
+            <w:tcBorders>
+              <w:top w:val="single" w:sz="4" w:color="D9D9D9"/>
+              <w:left w:val="single" w:sz="4" w:color="D9D9D9"/>
+              <w:bottom w:val="single" w:sz="4" w:color="D9D9D9"/>
+              <w:right w:val="single" w:sz="4" w:color="D9D9D9"/>
+            </w:tcBorders>
+            <w:shd w:fill="FFFFFF"/>
+            <w:tcMar>
+              <w:top w:w="90" w:type="dxa"/>
+              <w:left w:w="90" w:type="dxa"/>
+              <w:bottom w:w="90" w:type="dxa"/>
+              <w:right w:w="90" w:type="dxa"/>
+            </w:tcMar>
+          </w:tcPr>
+          <w:p>
+            <w:pPr>
+              <w:spacing w:after="40" w:line="252" w:lineRule="auto"/>
+            </w:pPr>
+            <w:r>
+              <w:rPr>
+                <w:sz w:val="19"/>
+              </w:rPr>
+              <w:t>O intervalo de 95% sorteia os dias quentes como se um não tivesse relação com o outro, mas dias quentes costumam vir em sequência. O intervalo pode ser mais estreito do que deveria.</w:t>
+            </w:r>
+          </w:p>
+        </w:tc>
+      </w:tr>
+      <w:tr>
+        <w:trPr>
+          <w:cantSplit/>
+        </w:trPr>
+        <w:tc>
+          <w:tcPr>
+            <w:tcW w:type="dxa" w:w="2551"/>
+            <w:vAlign w:val="center"/>
+            <w:tcBorders>
+              <w:top w:val="single" w:sz="4" w:color="D9D9D9"/>
+              <w:left w:val="single" w:sz="4" w:color="D9D9D9"/>
+              <w:bottom w:val="single" w:sz="4" w:color="D9D9D9"/>
+              <w:right w:val="single" w:sz="4" w:color="D9D9D9"/>
+            </w:tcBorders>
+            <w:shd w:fill="F0F4F7"/>
+            <w:tcMar>
+              <w:top w:w="90" w:type="dxa"/>
+              <w:left w:w="90" w:type="dxa"/>
+              <w:bottom w:w="90" w:type="dxa"/>
+              <w:right w:w="90" w:type="dxa"/>
+            </w:tcMar>
+          </w:tcPr>
+          <w:p>
+            <w:pPr>
+              <w:spacing w:after="40" w:line="252" w:lineRule="auto"/>
+            </w:pPr>
+            <w:r>
+              <w:rPr>
+                <w:sz w:val="19"/>
+              </w:rPr>
+              <w:t>Esperado tratado como exato</w:t>
+            </w:r>
+          </w:p>
+        </w:tc>
+        <w:tc>
+          <w:tcPr>
+            <w:tcW w:type="dxa" w:w="7087"/>
+            <w:vAlign w:val="center"/>
+            <w:tcBorders>
+              <w:top w:val="single" w:sz="4" w:color="D9D9D9"/>
+              <w:left w:val="single" w:sz="4" w:color="D9D9D9"/>
+              <w:bottom w:val="single" w:sz="4" w:color="D9D9D9"/>
+              <w:right w:val="single" w:sz="4" w:color="D9D9D9"/>
+            </w:tcBorders>
+            <w:shd w:fill="F0F4F7"/>
+            <w:tcMar>
+              <w:top w:w="90" w:type="dxa"/>
+              <w:left w:w="90" w:type="dxa"/>
+              <w:bottom w:w="90" w:type="dxa"/>
+              <w:right w:w="90" w:type="dxa"/>
+            </w:tcMar>
+          </w:tcPr>
+          <w:p>
+            <w:pPr>
+              <w:spacing w:after="40" w:line="252" w:lineRule="auto"/>
+            </w:pPr>
+            <w:r>
+              <w:rPr>
+                <w:sz w:val="19"/>
+              </w:rPr>
+              <w:t>O valor esperado vem de poucos dias de referência (no mínimo 2 por ano, mês e dia da semana) e é tratado como um número fixo. Essa incerteza não entra no intervalo.</w:t>
+            </w:r>
+          </w:p>
+        </w:tc>
+      </w:tr>
+      <w:tr>
+        <w:trPr>
+          <w:cantSplit/>
+        </w:trPr>
+        <w:tc>
+          <w:tcPr>
+            <w:tcW w:type="dxa" w:w="2551"/>
+            <w:vAlign w:val="center"/>
+            <w:tcBorders>
+              <w:top w:val="single" w:sz="4" w:color="D9D9D9"/>
+              <w:left w:val="single" w:sz="4" w:color="D9D9D9"/>
+              <w:bottom w:val="single" w:sz="4" w:color="D9D9D9"/>
+              <w:right w:val="single" w:sz="4" w:color="D9D9D9"/>
+            </w:tcBorders>
+            <w:shd w:fill="FFFFFF"/>
+            <w:tcMar>
+              <w:top w:w="90" w:type="dxa"/>
+              <w:left w:w="90" w:type="dxa"/>
+              <w:bottom w:w="90" w:type="dxa"/>
+              <w:right w:w="90" w:type="dxa"/>
+            </w:tcMar>
+          </w:tcPr>
+          <w:p>
+            <w:pPr>
+              <w:spacing w:after="40" w:line="252" w:lineRule="auto"/>
+            </w:pPr>
+            <w:r>
+              <w:rPr>
+                <w:sz w:val="19"/>
+              </w:rPr>
+              <w:t>Várias comparações</w:t>
+            </w:r>
+          </w:p>
+        </w:tc>
+        <w:tc>
+          <w:tcPr>
+            <w:tcW w:type="dxa" w:w="7087"/>
+            <w:vAlign w:val="center"/>
+            <w:tcBorders>
+              <w:top w:val="single" w:sz="4" w:color="D9D9D9"/>
+              <w:left w:val="single" w:sz="4" w:color="D9D9D9"/>
+              <w:bottom w:val="single" w:sz="4" w:color="D9D9D9"/>
+              <w:right w:val="single" w:sz="4" w:color="D9D9D9"/>
+            </w:tcBorders>
+            <w:shd w:fill="FFFFFF"/>
+            <w:tcMar>
+              <w:top w:w="90" w:type="dxa"/>
+              <w:left w:w="90" w:type="dxa"/>
+              <w:bottom w:w="90" w:type="dxa"/>
+              <w:right w:w="90" w:type="dxa"/>
+            </w:tcMar>
+          </w:tcPr>
+          <w:p>
+            <w:pPr>
+              <w:spacing w:after="40" w:line="252" w:lineRule="auto"/>
+            </w:pPr>
+            <w:r>
+              <w:rPr>
+                <w:sz w:val="19"/>
+              </w:rPr>
+              <w:t>São vários grupos de doença, idades, faixas de temperatura e limiares. Alguns intervalos podem deixar de incluir o zero apenas por acaso.</w:t>
+            </w:r>
+          </w:p>
+        </w:tc>
+      </w:tr>
+      <w:tr>
+        <w:trPr>
+          <w:cantSplit/>
+        </w:trPr>
+        <w:tc>
+          <w:tcPr>
+            <w:tcW w:type="dxa" w:w="2551"/>
+            <w:vAlign w:val="center"/>
+            <w:tcBorders>
+              <w:top w:val="single" w:sz="4" w:color="D9D9D9"/>
+              <w:left w:val="single" w:sz="4" w:color="D9D9D9"/>
+              <w:bottom w:val="single" w:sz="4" w:color="D9D9D9"/>
+              <w:right w:val="single" w:sz="4" w:color="D9D9D9"/>
+            </w:tcBorders>
+            <w:shd w:fill="F0F4F7"/>
+            <w:tcMar>
+              <w:top w:w="90" w:type="dxa"/>
+              <w:left w:w="90" w:type="dxa"/>
+              <w:bottom w:w="90" w:type="dxa"/>
+              <w:right w:w="90" w:type="dxa"/>
+            </w:tcMar>
+          </w:tcPr>
+          <w:p>
+            <w:pPr>
+              <w:spacing w:after="40" w:line="252" w:lineRule="auto"/>
+            </w:pPr>
+            <w:r>
+              <w:rPr>
+                <w:sz w:val="19"/>
+              </w:rPr>
+              <w:t>Checagem complementar</w:t>
+            </w:r>
+          </w:p>
+        </w:tc>
+        <w:tc>
+          <w:tcPr>
+            <w:tcW w:type="dxa" w:w="7087"/>
+            <w:vAlign w:val="center"/>
+            <w:tcBorders>
+              <w:top w:val="single" w:sz="4" w:color="D9D9D9"/>
+              <w:left w:val="single" w:sz="4" w:color="D9D9D9"/>
+              <w:bottom w:val="single" w:sz="4" w:color="D9D9D9"/>
+              <w:right w:val="single" w:sz="4" w:color="D9D9D9"/>
+            </w:tcBorders>
+            <w:shd w:fill="F0F4F7"/>
+            <w:tcMar>
+              <w:top w:w="90" w:type="dxa"/>
+              <w:left w:w="90" w:type="dxa"/>
+              <w:bottom w:w="90" w:type="dxa"/>
+              <w:right w:w="90" w:type="dxa"/>
+            </w:tcMar>
+          </w:tcPr>
+          <w:p>
+            <w:pPr>
+              <w:spacing w:after="40" w:line="252" w:lineRule="auto"/>
+            </w:pPr>
+            <w:r>
+              <w:rPr>
+                <w:sz w:val="19"/>
+              </w:rPr>
+              <w:t>Os scripts 06 e 08 de exploracao_saude/ repetem a análise com regressão de Poisson e erros robustos à repetição entre dias seguidos. É uma conferência do método descritivo; não é calculada no dashboard.</w:t>
+            </w:r>
+          </w:p>
+        </w:tc>
+      </w:tr>
+    </w:tbl>
+    <w:p/>
+    <w:p>
+      <w:r>
         <w:br w:type="page"/>
       </w:r>
     </w:p>
@@ -4800,12 +5143,745 @@
     </w:p>
     <w:p>
       <w:r>
-        <w:t>painel.py coordena a aplicação. iniciar_base obtém a base; recortar_base aplica o ano selecionado; main chama indicadores_diarios, indicadores_noturnos e episodios_quentes. mostrar_exposicao desenha os cartões e gráficos de evolução e frequência; mostrar_rotina apresenta horário, noite e umidade; mostrar_persistencia exibe os episódios; mostrar_saude desenha a seção Calor e internações, com barras_agrupadas (Altair) para os dois gráficos de barras.</w:t>
+        <w:t>painel.py coordena a aplicação. iniciar_base obtém a base e carregar_online consulta o Open-Meteo, com cache; recortar_base aplica o ano selecionado. main chama indicadores_diarios, indicadores_noturnos, episodios_quentes, perfil_horario e correlacao_calor_umidade e, em seguida, as funções que desenham cada parte da página.</w:t>
       </w:r>
     </w:p>
+    <w:tbl>
+      <w:tblPr>
+        <w:tblW w:type="auto" w:w="0"/>
+        <w:jc w:val="center"/>
+        <w:tblLayout w:type="fixed"/>
+        <w:tblLook w:firstColumn="1" w:firstRow="1" w:lastColumn="0" w:lastRow="0" w:noHBand="0" w:noVBand="1" w:val="04A0"/>
+      </w:tblPr>
+      <w:tblGrid>
+        <w:gridCol w:w="2551"/>
+        <w:gridCol w:w="7087"/>
+      </w:tblGrid>
+      <w:tr>
+        <w:trPr>
+          <w:tblHeader/>
+          <w:cantSplit/>
+        </w:trPr>
+        <w:tc>
+          <w:tcPr>
+            <w:tcW w:type="dxa" w:w="2551"/>
+            <w:vAlign w:val="center"/>
+            <w:tcBorders>
+              <w:top w:val="single" w:sz="4" w:color="D9D9D9"/>
+              <w:left w:val="single" w:sz="4" w:color="D9D9D9"/>
+              <w:bottom w:val="single" w:sz="4" w:color="D9D9D9"/>
+              <w:right w:val="single" w:sz="4" w:color="D9D9D9"/>
+            </w:tcBorders>
+            <w:shd w:fill="24475C"/>
+            <w:tcMar>
+              <w:top w:w="90" w:type="dxa"/>
+              <w:left w:w="90" w:type="dxa"/>
+              <w:bottom w:w="90" w:type="dxa"/>
+              <w:right w:w="90" w:type="dxa"/>
+            </w:tcMar>
+          </w:tcPr>
+          <w:p>
+            <w:pPr>
+              <w:spacing w:after="40" w:line="252" w:lineRule="auto"/>
+            </w:pPr>
+            <w:r>
+              <w:rPr>
+                <w:b/>
+                <w:color w:val="FFFFFF"/>
+                <w:sz w:val="19"/>
+              </w:rPr>
+              <w:t>Função de painel.py</w:t>
+            </w:r>
+          </w:p>
+        </w:tc>
+        <w:tc>
+          <w:tcPr>
+            <w:tcW w:type="dxa" w:w="7087"/>
+            <w:vAlign w:val="center"/>
+            <w:tcBorders>
+              <w:top w:val="single" w:sz="4" w:color="D9D9D9"/>
+              <w:left w:val="single" w:sz="4" w:color="D9D9D9"/>
+              <w:bottom w:val="single" w:sz="4" w:color="D9D9D9"/>
+              <w:right w:val="single" w:sz="4" w:color="D9D9D9"/>
+            </w:tcBorders>
+            <w:shd w:fill="24475C"/>
+            <w:tcMar>
+              <w:top w:w="90" w:type="dxa"/>
+              <w:left w:w="90" w:type="dxa"/>
+              <w:bottom w:w="90" w:type="dxa"/>
+              <w:right w:w="90" w:type="dxa"/>
+            </w:tcMar>
+          </w:tcPr>
+          <w:p>
+            <w:pPr>
+              <w:spacing w:after="40" w:line="252" w:lineRule="auto"/>
+            </w:pPr>
+            <w:r>
+              <w:rPr>
+                <w:b/>
+                <w:color w:val="FFFFFF"/>
+                <w:sz w:val="19"/>
+              </w:rPr>
+              <w:t>Papel</w:t>
+            </w:r>
+          </w:p>
+        </w:tc>
+      </w:tr>
+      <w:tr>
+        <w:trPr>
+          <w:cantSplit/>
+        </w:trPr>
+        <w:tc>
+          <w:tcPr>
+            <w:tcW w:type="dxa" w:w="2551"/>
+            <w:vAlign w:val="center"/>
+            <w:tcBorders>
+              <w:top w:val="single" w:sz="4" w:color="D9D9D9"/>
+              <w:left w:val="single" w:sz="4" w:color="D9D9D9"/>
+              <w:bottom w:val="single" w:sz="4" w:color="D9D9D9"/>
+              <w:right w:val="single" w:sz="4" w:color="D9D9D9"/>
+            </w:tcBorders>
+            <w:shd w:fill="FFFFFF"/>
+            <w:tcMar>
+              <w:top w:w="90" w:type="dxa"/>
+              <w:left w:w="90" w:type="dxa"/>
+              <w:bottom w:w="90" w:type="dxa"/>
+              <w:right w:w="90" w:type="dxa"/>
+            </w:tcMar>
+          </w:tcPr>
+          <w:p>
+            <w:pPr>
+              <w:spacing w:after="40" w:line="252" w:lineRule="auto"/>
+            </w:pPr>
+            <w:r>
+              <w:rPr>
+                <w:sz w:val="19"/>
+              </w:rPr>
+              <w:t>mostrar_arquitetura</w:t>
+            </w:r>
+          </w:p>
+        </w:tc>
+        <w:tc>
+          <w:tcPr>
+            <w:tcW w:type="dxa" w:w="7087"/>
+            <w:vAlign w:val="center"/>
+            <w:tcBorders>
+              <w:top w:val="single" w:sz="4" w:color="D9D9D9"/>
+              <w:left w:val="single" w:sz="4" w:color="D9D9D9"/>
+              <w:bottom w:val="single" w:sz="4" w:color="D9D9D9"/>
+              <w:right w:val="single" w:sz="4" w:color="D9D9D9"/>
+            </w:tcBorders>
+            <w:shd w:fill="FFFFFF"/>
+            <w:tcMar>
+              <w:top w:w="90" w:type="dxa"/>
+              <w:left w:w="90" w:type="dxa"/>
+              <w:bottom w:w="90" w:type="dxa"/>
+              <w:right w:w="90" w:type="dxa"/>
+            </w:tcMar>
+          </w:tcPr>
+          <w:p>
+            <w:pPr>
+              <w:spacing w:after="40" w:line="252" w:lineRule="auto"/>
+            </w:pPr>
+            <w:r>
+              <w:rPr>
+                <w:sz w:val="19"/>
+              </w:rPr>
+              <w:t>Apresenta os requisitos, o diagrama e o fluxo técnico antes das análises</w:t>
+            </w:r>
+          </w:p>
+        </w:tc>
+      </w:tr>
+      <w:tr>
+        <w:trPr>
+          <w:cantSplit/>
+        </w:trPr>
+        <w:tc>
+          <w:tcPr>
+            <w:tcW w:type="dxa" w:w="2551"/>
+            <w:vAlign w:val="center"/>
+            <w:tcBorders>
+              <w:top w:val="single" w:sz="4" w:color="D9D9D9"/>
+              <w:left w:val="single" w:sz="4" w:color="D9D9D9"/>
+              <w:bottom w:val="single" w:sz="4" w:color="D9D9D9"/>
+              <w:right w:val="single" w:sz="4" w:color="D9D9D9"/>
+            </w:tcBorders>
+            <w:shd w:fill="F0F4F7"/>
+            <w:tcMar>
+              <w:top w:w="90" w:type="dxa"/>
+              <w:left w:w="90" w:type="dxa"/>
+              <w:bottom w:w="90" w:type="dxa"/>
+              <w:right w:w="90" w:type="dxa"/>
+            </w:tcMar>
+          </w:tcPr>
+          <w:p>
+            <w:pPr>
+              <w:spacing w:after="40" w:line="252" w:lineRule="auto"/>
+            </w:pPr>
+            <w:r>
+              <w:rPr>
+                <w:sz w:val="19"/>
+              </w:rPr>
+              <w:t>mostrar_fontes</w:t>
+            </w:r>
+          </w:p>
+        </w:tc>
+        <w:tc>
+          <w:tcPr>
+            <w:tcW w:type="dxa" w:w="7087"/>
+            <w:vAlign w:val="center"/>
+            <w:tcBorders>
+              <w:top w:val="single" w:sz="4" w:color="D9D9D9"/>
+              <w:left w:val="single" w:sz="4" w:color="D9D9D9"/>
+              <w:bottom w:val="single" w:sz="4" w:color="D9D9D9"/>
+              <w:right w:val="single" w:sz="4" w:color="D9D9D9"/>
+            </w:tcBorders>
+            <w:shd w:fill="F0F4F7"/>
+            <w:tcMar>
+              <w:top w:w="90" w:type="dxa"/>
+              <w:left w:w="90" w:type="dxa"/>
+              <w:bottom w:w="90" w:type="dxa"/>
+              <w:right w:w="90" w:type="dxa"/>
+            </w:tcMar>
+          </w:tcPr>
+          <w:p>
+            <w:pPr>
+              <w:spacing w:after="40" w:line="252" w:lineRule="auto"/>
+            </w:pPr>
+            <w:r>
+              <w:rPr>
+                <w:sz w:val="19"/>
+              </w:rPr>
+              <w:t>Explica de onde vêm os dados, em linguagem simples, antes dos gráficos</w:t>
+            </w:r>
+          </w:p>
+        </w:tc>
+      </w:tr>
+      <w:tr>
+        <w:trPr>
+          <w:cantSplit/>
+        </w:trPr>
+        <w:tc>
+          <w:tcPr>
+            <w:tcW w:type="dxa" w:w="2551"/>
+            <w:vAlign w:val="center"/>
+            <w:tcBorders>
+              <w:top w:val="single" w:sz="4" w:color="D9D9D9"/>
+              <w:left w:val="single" w:sz="4" w:color="D9D9D9"/>
+              <w:bottom w:val="single" w:sz="4" w:color="D9D9D9"/>
+              <w:right w:val="single" w:sz="4" w:color="D9D9D9"/>
+            </w:tcBorders>
+            <w:shd w:fill="FFFFFF"/>
+            <w:tcMar>
+              <w:top w:w="90" w:type="dxa"/>
+              <w:left w:w="90" w:type="dxa"/>
+              <w:bottom w:w="90" w:type="dxa"/>
+              <w:right w:w="90" w:type="dxa"/>
+            </w:tcMar>
+          </w:tcPr>
+          <w:p>
+            <w:pPr>
+              <w:spacing w:after="40" w:line="252" w:lineRule="auto"/>
+            </w:pPr>
+            <w:r>
+              <w:rPr>
+                <w:sz w:val="19"/>
+              </w:rPr>
+              <w:t>mostrar_controles</w:t>
+            </w:r>
+          </w:p>
+        </w:tc>
+        <w:tc>
+          <w:tcPr>
+            <w:tcW w:type="dxa" w:w="7087"/>
+            <w:vAlign w:val="center"/>
+            <w:tcBorders>
+              <w:top w:val="single" w:sz="4" w:color="D9D9D9"/>
+              <w:left w:val="single" w:sz="4" w:color="D9D9D9"/>
+              <w:bottom w:val="single" w:sz="4" w:color="D9D9D9"/>
+              <w:right w:val="single" w:sz="4" w:color="D9D9D9"/>
+            </w:tcBorders>
+            <w:shd w:fill="FFFFFF"/>
+            <w:tcMar>
+              <w:top w:w="90" w:type="dxa"/>
+              <w:left w:w="90" w:type="dxa"/>
+              <w:bottom w:w="90" w:type="dxa"/>
+              <w:right w:w="90" w:type="dxa"/>
+            </w:tcMar>
+          </w:tcPr>
+          <w:p>
+            <w:pPr>
+              <w:spacing w:after="40" w:line="252" w:lineRule="auto"/>
+            </w:pPr>
+            <w:r>
+              <w:rPr>
+                <w:sz w:val="19"/>
+              </w:rPr>
+              <w:t>Mostra o filtro de período e o controle do limiar e devolve as duas escolhas</w:t>
+            </w:r>
+          </w:p>
+        </w:tc>
+      </w:tr>
+      <w:tr>
+        <w:trPr>
+          <w:cantSplit/>
+        </w:trPr>
+        <w:tc>
+          <w:tcPr>
+            <w:tcW w:type="dxa" w:w="2551"/>
+            <w:vAlign w:val="center"/>
+            <w:tcBorders>
+              <w:top w:val="single" w:sz="4" w:color="D9D9D9"/>
+              <w:left w:val="single" w:sz="4" w:color="D9D9D9"/>
+              <w:bottom w:val="single" w:sz="4" w:color="D9D9D9"/>
+              <w:right w:val="single" w:sz="4" w:color="D9D9D9"/>
+            </w:tcBorders>
+            <w:shd w:fill="F0F4F7"/>
+            <w:tcMar>
+              <w:top w:w="90" w:type="dxa"/>
+              <w:left w:w="90" w:type="dxa"/>
+              <w:bottom w:w="90" w:type="dxa"/>
+              <w:right w:w="90" w:type="dxa"/>
+            </w:tcMar>
+          </w:tcPr>
+          <w:p>
+            <w:pPr>
+              <w:spacing w:after="40" w:line="252" w:lineRule="auto"/>
+            </w:pPr>
+            <w:r>
+              <w:rPr>
+                <w:sz w:val="19"/>
+              </w:rPr>
+              <w:t>mostrar_exposicao</w:t>
+            </w:r>
+          </w:p>
+        </w:tc>
+        <w:tc>
+          <w:tcPr>
+            <w:tcW w:type="dxa" w:w="7087"/>
+            <w:vAlign w:val="center"/>
+            <w:tcBorders>
+              <w:top w:val="single" w:sz="4" w:color="D9D9D9"/>
+              <w:left w:val="single" w:sz="4" w:color="D9D9D9"/>
+              <w:bottom w:val="single" w:sz="4" w:color="D9D9D9"/>
+              <w:right w:val="single" w:sz="4" w:color="D9D9D9"/>
+            </w:tcBorders>
+            <w:shd w:fill="F0F4F7"/>
+            <w:tcMar>
+              <w:top w:w="90" w:type="dxa"/>
+              <w:left w:w="90" w:type="dxa"/>
+              <w:bottom w:w="90" w:type="dxa"/>
+              <w:right w:w="90" w:type="dxa"/>
+            </w:tcMar>
+          </w:tcPr>
+          <w:p>
+            <w:pPr>
+              <w:spacing w:after="40" w:line="252" w:lineRule="auto"/>
+            </w:pPr>
+            <w:r>
+              <w:rPr>
+                <w:sz w:val="19"/>
+              </w:rPr>
+              <w:t>Desenha os cartões e os gráficos de evolução e de frequência</w:t>
+            </w:r>
+          </w:p>
+        </w:tc>
+      </w:tr>
+      <w:tr>
+        <w:trPr>
+          <w:cantSplit/>
+        </w:trPr>
+        <w:tc>
+          <w:tcPr>
+            <w:tcW w:type="dxa" w:w="2551"/>
+            <w:vAlign w:val="center"/>
+            <w:tcBorders>
+              <w:top w:val="single" w:sz="4" w:color="D9D9D9"/>
+              <w:left w:val="single" w:sz="4" w:color="D9D9D9"/>
+              <w:bottom w:val="single" w:sz="4" w:color="D9D9D9"/>
+              <w:right w:val="single" w:sz="4" w:color="D9D9D9"/>
+            </w:tcBorders>
+            <w:shd w:fill="FFFFFF"/>
+            <w:tcMar>
+              <w:top w:w="90" w:type="dxa"/>
+              <w:left w:w="90" w:type="dxa"/>
+              <w:bottom w:w="90" w:type="dxa"/>
+              <w:right w:w="90" w:type="dxa"/>
+            </w:tcMar>
+          </w:tcPr>
+          <w:p>
+            <w:pPr>
+              <w:spacing w:after="40" w:line="252" w:lineRule="auto"/>
+            </w:pPr>
+            <w:r>
+              <w:rPr>
+                <w:sz w:val="19"/>
+              </w:rPr>
+              <w:t>mostrar_rotina</w:t>
+            </w:r>
+          </w:p>
+        </w:tc>
+        <w:tc>
+          <w:tcPr>
+            <w:tcW w:type="dxa" w:w="7087"/>
+            <w:vAlign w:val="center"/>
+            <w:tcBorders>
+              <w:top w:val="single" w:sz="4" w:color="D9D9D9"/>
+              <w:left w:val="single" w:sz="4" w:color="D9D9D9"/>
+              <w:bottom w:val="single" w:sz="4" w:color="D9D9D9"/>
+              <w:right w:val="single" w:sz="4" w:color="D9D9D9"/>
+            </w:tcBorders>
+            <w:shd w:fill="FFFFFF"/>
+            <w:tcMar>
+              <w:top w:w="90" w:type="dxa"/>
+              <w:left w:w="90" w:type="dxa"/>
+              <w:bottom w:w="90" w:type="dxa"/>
+              <w:right w:w="90" w:type="dxa"/>
+            </w:tcMar>
+          </w:tcPr>
+          <w:p>
+            <w:pPr>
+              <w:spacing w:after="40" w:line="252" w:lineRule="auto"/>
+            </w:pPr>
+            <w:r>
+              <w:rPr>
+                <w:sz w:val="19"/>
+              </w:rPr>
+              <w:t>Apresenta horário, noite e umidade</w:t>
+            </w:r>
+          </w:p>
+        </w:tc>
+      </w:tr>
+      <w:tr>
+        <w:trPr>
+          <w:cantSplit/>
+        </w:trPr>
+        <w:tc>
+          <w:tcPr>
+            <w:tcW w:type="dxa" w:w="2551"/>
+            <w:vAlign w:val="center"/>
+            <w:tcBorders>
+              <w:top w:val="single" w:sz="4" w:color="D9D9D9"/>
+              <w:left w:val="single" w:sz="4" w:color="D9D9D9"/>
+              <w:bottom w:val="single" w:sz="4" w:color="D9D9D9"/>
+              <w:right w:val="single" w:sz="4" w:color="D9D9D9"/>
+            </w:tcBorders>
+            <w:shd w:fill="F0F4F7"/>
+            <w:tcMar>
+              <w:top w:w="90" w:type="dxa"/>
+              <w:left w:w="90" w:type="dxa"/>
+              <w:bottom w:w="90" w:type="dxa"/>
+              <w:right w:w="90" w:type="dxa"/>
+            </w:tcMar>
+          </w:tcPr>
+          <w:p>
+            <w:pPr>
+              <w:spacing w:after="40" w:line="252" w:lineRule="auto"/>
+            </w:pPr>
+            <w:r>
+              <w:rPr>
+                <w:sz w:val="19"/>
+              </w:rPr>
+              <w:t>mostrar_persistencia</w:t>
+            </w:r>
+          </w:p>
+        </w:tc>
+        <w:tc>
+          <w:tcPr>
+            <w:tcW w:type="dxa" w:w="7087"/>
+            <w:vAlign w:val="center"/>
+            <w:tcBorders>
+              <w:top w:val="single" w:sz="4" w:color="D9D9D9"/>
+              <w:left w:val="single" w:sz="4" w:color="D9D9D9"/>
+              <w:bottom w:val="single" w:sz="4" w:color="D9D9D9"/>
+              <w:right w:val="single" w:sz="4" w:color="D9D9D9"/>
+            </w:tcBorders>
+            <w:shd w:fill="F0F4F7"/>
+            <w:tcMar>
+              <w:top w:w="90" w:type="dxa"/>
+              <w:left w:w="90" w:type="dxa"/>
+              <w:bottom w:w="90" w:type="dxa"/>
+              <w:right w:w="90" w:type="dxa"/>
+            </w:tcMar>
+          </w:tcPr>
+          <w:p>
+            <w:pPr>
+              <w:spacing w:after="40" w:line="252" w:lineRule="auto"/>
+            </w:pPr>
+            <w:r>
+              <w:rPr>
+                <w:sz w:val="19"/>
+              </w:rPr>
+              <w:t>Exibe as sequências de calor persistente</w:t>
+            </w:r>
+          </w:p>
+        </w:tc>
+      </w:tr>
+      <w:tr>
+        <w:trPr>
+          <w:cantSplit/>
+        </w:trPr>
+        <w:tc>
+          <w:tcPr>
+            <w:tcW w:type="dxa" w:w="2551"/>
+            <w:vAlign w:val="center"/>
+            <w:tcBorders>
+              <w:top w:val="single" w:sz="4" w:color="D9D9D9"/>
+              <w:left w:val="single" w:sz="4" w:color="D9D9D9"/>
+              <w:bottom w:val="single" w:sz="4" w:color="D9D9D9"/>
+              <w:right w:val="single" w:sz="4" w:color="D9D9D9"/>
+            </w:tcBorders>
+            <w:shd w:fill="FFFFFF"/>
+            <w:tcMar>
+              <w:top w:w="90" w:type="dxa"/>
+              <w:left w:w="90" w:type="dxa"/>
+              <w:bottom w:w="90" w:type="dxa"/>
+              <w:right w:w="90" w:type="dxa"/>
+            </w:tcMar>
+          </w:tcPr>
+          <w:p>
+            <w:pPr>
+              <w:spacing w:after="40" w:line="252" w:lineRule="auto"/>
+            </w:pPr>
+            <w:r>
+              <w:rPr>
+                <w:sz w:val="19"/>
+              </w:rPr>
+              <w:t>carregar_saude</w:t>
+            </w:r>
+          </w:p>
+        </w:tc>
+        <w:tc>
+          <w:tcPr>
+            <w:tcW w:type="dxa" w:w="7087"/>
+            <w:vAlign w:val="center"/>
+            <w:tcBorders>
+              <w:top w:val="single" w:sz="4" w:color="D9D9D9"/>
+              <w:left w:val="single" w:sz="4" w:color="D9D9D9"/>
+              <w:bottom w:val="single" w:sz="4" w:color="D9D9D9"/>
+              <w:right w:val="single" w:sz="4" w:color="D9D9D9"/>
+            </w:tcBorders>
+            <w:shd w:fill="FFFFFF"/>
+            <w:tcMar>
+              <w:top w:w="90" w:type="dxa"/>
+              <w:left w:w="90" w:type="dxa"/>
+              <w:bottom w:w="90" w:type="dxa"/>
+              <w:right w:w="90" w:type="dxa"/>
+            </w:tcMar>
+          </w:tcPr>
+          <w:p>
+            <w:pPr>
+              <w:spacing w:after="40" w:line="252" w:lineRule="auto"/>
+            </w:pPr>
+            <w:r>
+              <w:rPr>
+                <w:sz w:val="19"/>
+              </w:rPr>
+              <w:t>Lê a tabela de internações uma vez e a guarda em cache</w:t>
+            </w:r>
+          </w:p>
+        </w:tc>
+      </w:tr>
+      <w:tr>
+        <w:trPr>
+          <w:cantSplit/>
+        </w:trPr>
+        <w:tc>
+          <w:tcPr>
+            <w:tcW w:type="dxa" w:w="2551"/>
+            <w:vAlign w:val="center"/>
+            <w:tcBorders>
+              <w:top w:val="single" w:sz="4" w:color="D9D9D9"/>
+              <w:left w:val="single" w:sz="4" w:color="D9D9D9"/>
+              <w:bottom w:val="single" w:sz="4" w:color="D9D9D9"/>
+              <w:right w:val="single" w:sz="4" w:color="D9D9D9"/>
+            </w:tcBorders>
+            <w:shd w:fill="F0F4F7"/>
+            <w:tcMar>
+              <w:top w:w="90" w:type="dxa"/>
+              <w:left w:w="90" w:type="dxa"/>
+              <w:bottom w:w="90" w:type="dxa"/>
+              <w:right w:w="90" w:type="dxa"/>
+            </w:tcMar>
+          </w:tcPr>
+          <w:p>
+            <w:pPr>
+              <w:spacing w:after="40" w:line="252" w:lineRule="auto"/>
+            </w:pPr>
+            <w:r>
+              <w:rPr>
+                <w:sz w:val="19"/>
+              </w:rPr>
+              <w:t>mostrar_saude</w:t>
+            </w:r>
+          </w:p>
+        </w:tc>
+        <w:tc>
+          <w:tcPr>
+            <w:tcW w:type="dxa" w:w="7087"/>
+            <w:vAlign w:val="center"/>
+            <w:tcBorders>
+              <w:top w:val="single" w:sz="4" w:color="D9D9D9"/>
+              <w:left w:val="single" w:sz="4" w:color="D9D9D9"/>
+              <w:bottom w:val="single" w:sz="4" w:color="D9D9D9"/>
+              <w:right w:val="single" w:sz="4" w:color="D9D9D9"/>
+            </w:tcBorders>
+            <w:shd w:fill="F0F4F7"/>
+            <w:tcMar>
+              <w:top w:w="90" w:type="dxa"/>
+              <w:left w:w="90" w:type="dxa"/>
+              <w:bottom w:w="90" w:type="dxa"/>
+              <w:right w:w="90" w:type="dxa"/>
+            </w:tcMar>
+          </w:tcPr>
+          <w:p>
+            <w:pPr>
+              <w:spacing w:after="40" w:line="252" w:lineRule="auto"/>
+            </w:pPr>
+            <w:r>
+              <w:rPr>
+                <w:sz w:val="19"/>
+              </w:rPr>
+              <w:t>Desenha a seção Calor e internações; usa barras_agrupadas (Altair) nos dois gráficos de barras</w:t>
+            </w:r>
+          </w:p>
+        </w:tc>
+      </w:tr>
+      <w:tr>
+        <w:trPr>
+          <w:cantSplit/>
+        </w:trPr>
+        <w:tc>
+          <w:tcPr>
+            <w:tcW w:type="dxa" w:w="2551"/>
+            <w:vAlign w:val="center"/>
+            <w:tcBorders>
+              <w:top w:val="single" w:sz="4" w:color="D9D9D9"/>
+              <w:left w:val="single" w:sz="4" w:color="D9D9D9"/>
+              <w:bottom w:val="single" w:sz="4" w:color="D9D9D9"/>
+              <w:right w:val="single" w:sz="4" w:color="D9D9D9"/>
+            </w:tcBorders>
+            <w:shd w:fill="FFFFFF"/>
+            <w:tcMar>
+              <w:top w:w="90" w:type="dxa"/>
+              <w:left w:w="90" w:type="dxa"/>
+              <w:bottom w:w="90" w:type="dxa"/>
+              <w:right w:w="90" w:type="dxa"/>
+            </w:tcMar>
+          </w:tcPr>
+          <w:p>
+            <w:pPr>
+              <w:spacing w:after="40" w:line="252" w:lineRule="auto"/>
+            </w:pPr>
+            <w:r>
+              <w:rPr>
+                <w:sz w:val="19"/>
+              </w:rPr>
+              <w:t>mostrar_conclusoes</w:t>
+            </w:r>
+          </w:p>
+        </w:tc>
+        <w:tc>
+          <w:tcPr>
+            <w:tcW w:type="dxa" w:w="7087"/>
+            <w:vAlign w:val="center"/>
+            <w:tcBorders>
+              <w:top w:val="single" w:sz="4" w:color="D9D9D9"/>
+              <w:left w:val="single" w:sz="4" w:color="D9D9D9"/>
+              <w:bottom w:val="single" w:sz="4" w:color="D9D9D9"/>
+              <w:right w:val="single" w:sz="4" w:color="D9D9D9"/>
+            </w:tcBorders>
+            <w:shd w:fill="FFFFFF"/>
+            <w:tcMar>
+              <w:top w:w="90" w:type="dxa"/>
+              <w:left w:w="90" w:type="dxa"/>
+              <w:bottom w:w="90" w:type="dxa"/>
+              <w:right w:w="90" w:type="dxa"/>
+            </w:tcMar>
+          </w:tcPr>
+          <w:p>
+            <w:pPr>
+              <w:spacing w:after="40" w:line="252" w:lineRule="auto"/>
+            </w:pPr>
+            <w:r>
+              <w:rPr>
+                <w:sz w:val="19"/>
+              </w:rPr>
+              <w:t>Resume, em linguagem simples, o que os gráficos mostram e o que não permitem concluir</w:t>
+            </w:r>
+          </w:p>
+        </w:tc>
+      </w:tr>
+      <w:tr>
+        <w:trPr>
+          <w:cantSplit/>
+        </w:trPr>
+        <w:tc>
+          <w:tcPr>
+            <w:tcW w:type="dxa" w:w="2551"/>
+            <w:vAlign w:val="center"/>
+            <w:tcBorders>
+              <w:top w:val="single" w:sz="4" w:color="D9D9D9"/>
+              <w:left w:val="single" w:sz="4" w:color="D9D9D9"/>
+              <w:bottom w:val="single" w:sz="4" w:color="D9D9D9"/>
+              <w:right w:val="single" w:sz="4" w:color="D9D9D9"/>
+            </w:tcBorders>
+            <w:shd w:fill="F0F4F7"/>
+            <w:tcMar>
+              <w:top w:w="90" w:type="dxa"/>
+              <w:left w:w="90" w:type="dxa"/>
+              <w:bottom w:w="90" w:type="dxa"/>
+              <w:right w:w="90" w:type="dxa"/>
+            </w:tcMar>
+          </w:tcPr>
+          <w:p>
+            <w:pPr>
+              <w:spacing w:after="40" w:line="252" w:lineRule="auto"/>
+            </w:pPr>
+            <w:r>
+              <w:rPr>
+                <w:sz w:val="19"/>
+              </w:rPr>
+              <w:t>mostrar_glossario</w:t>
+            </w:r>
+          </w:p>
+        </w:tc>
+        <w:tc>
+          <w:tcPr>
+            <w:tcW w:type="dxa" w:w="7087"/>
+            <w:vAlign w:val="center"/>
+            <w:tcBorders>
+              <w:top w:val="single" w:sz="4" w:color="D9D9D9"/>
+              <w:left w:val="single" w:sz="4" w:color="D9D9D9"/>
+              <w:bottom w:val="single" w:sz="4" w:color="D9D9D9"/>
+              <w:right w:val="single" w:sz="4" w:color="D9D9D9"/>
+            </w:tcBorders>
+            <w:shd w:fill="F0F4F7"/>
+            <w:tcMar>
+              <w:top w:w="90" w:type="dxa"/>
+              <w:left w:w="90" w:type="dxa"/>
+              <w:bottom w:w="90" w:type="dxa"/>
+              <w:right w:w="90" w:type="dxa"/>
+            </w:tcMar>
+          </w:tcPr>
+          <w:p>
+            <w:pPr>
+              <w:spacing w:after="40" w:line="252" w:lineRule="auto"/>
+            </w:pPr>
+            <w:r>
+              <w:rPr>
+                <w:sz w:val="19"/>
+              </w:rPr>
+              <w:t>Explica os termos de estatística e de clima usados na página</w:t>
+            </w:r>
+          </w:p>
+        </w:tc>
+      </w:tr>
+    </w:tbl>
+    <w:p/>
     <w:p>
       <w:r>
-        <w:t>A interface chama numero de apoio.py para formatar os valores apresentados. Parte das agregações visuais, como médias mensais e perfil horário, ainda está em painel.py. A separação entre apresentação e cálculo é, portanto, parcial.</w:t>
+        <w:t>A interface chama numero de apoio.py para formatar os valores apresentados. O perfil horário é calculado em analise.py (perfil_horario), mas parte das agregações visuais, como as médias mensais dos gráficos, ainda está em painel.py. A separação entre apresentação e cálculo é, portanto, parcial.</w:t>
       </w:r>
     </w:p>
     <w:p>
@@ -5239,7 +6315,7 @@
     </w:p>
     <w:p>
       <w:r>
-        <w:t>Recebe tabelas do Pandas e devolve resultados analíticos sem exigir interface. indicadores_diarios agrega dias e verifica cobertura; indicadores_noturnos organiza janelas de descanso; episodios_quentes identifica sequências; resumo_anual calcula contagens, médias e frequências. gerar_relatorio monta o texto auxiliar com critérios, indicadores e limitações.</w:t>
+        <w:t>Recebe tabelas do Pandas e devolve resultados analíticos sem exigir interface. indicadores_diarios agrega dias e verifica cobertura; indicadores_noturnos organiza janelas de descanso; episodios_quentes identifica sequências; resumo_anual calcula contagens, médias e frequências; perfil_horario calcula a temperatura média de cada hora do dia; correlacao_calor_umidade calcula o coeficiente de Pearson entre temperatura e umidade médias diárias. gerar_relatorio monta o texto auxiliar com critérios, indicadores e limitações.</w:t>
       </w:r>
     </w:p>
     <w:p>
@@ -6540,7 +7616,7 @@
               <w:rPr>
                 <w:sz w:val="19"/>
               </w:rPr>
-              <w:t>iniciar_base, recortar_base, mostrar_exposicao, mostrar_rotina, mostrar_persistencia, mostrar_saude, barras_agrupadas, main</w:t>
+              <w:t>iniciar_base, carregar_online, recortar_base, mostrar_arquitetura, mostrar_fontes, mostrar_controles, mostrar_exposicao, mostrar_rotina, mostrar_persistencia, carregar_saude, mostrar_saude, barras_agrupadas, mostrar_conclusoes, mostrar_glossario, main</w:t>
             </w:r>
           </w:p>
         </w:tc>
@@ -6670,7 +7746,7 @@
               <w:rPr>
                 <w:sz w:val="19"/>
               </w:rPr>
-              <w:t>indicadores_diarios, indicadores_noturnos, episodios_quentes, resumo_anual</w:t>
+              <w:t>indicadores_diarios, indicadores_noturnos, episodios_quentes, resumo_anual, perfil_horario, correlacao_calor_umidade</w:t>
             </w:r>
           </w:p>
         </w:tc>

</xml_diff>

<commit_message>
Melhora os gráficos: meses em português, intervalo de 95% nas barras e arquitetura no fim da página
- Temperatura ao longo do tempo e à noite com meses em português (Altair).
- Gráficos de internações com o intervalo de 95% em cada barra.
- Mesma cor para o mesmo grupo de doença nos dois gráficos de internações.
- Dispersão calor e umidade sem forçar o eixo a começar em zero.
- Seção de arquitetura movida para o final da página, com aviso no topo.
- Documento, PDF e páginas de conferência regenerados.
</commit_message>
<xml_diff>
--- a/documentacao/Arquitetura_do_dashboard_Heliopolis.docx
+++ b/documentacao/Arquitetura_do_dashboard_Heliopolis.docx
@@ -4751,7 +4751,7 @@
     <w:p/>
     <w:p>
       <w:r>
-        <w:t>Os gráficos de barras desta seção usam Altair, instalado junto com o Streamlit, para deixar os nomes do eixo na horizontal. saude.py faz as contas e interpretacao.py escreve as leituras em linguagem simples (leitura_saude e leitura_faixas), sem desenhar gráficos.</w:t>
+        <w:t>Os gráficos de barras desta seção usam Altair, instalado junto com o Streamlit, para deixar os nomes do eixo na horizontal e mostrar o intervalo de 95% em cada barra, como uma linha com marcas nas pontas. Uma mesma doença tem a mesma cor nos dois gráficos (vermelho para doenças do coração e da circulação, azul para as respiratórias). Se a linha de uma barra cruza o zero, o gráfico já indica que não há diferença clara. saude.py faz as contas e interpretacao.py escreve as leituras em linguagem simples (leitura_saude e leitura_faixas), sem desenhar gráficos.</w:t>
       </w:r>
     </w:p>
     <w:p>
@@ -5287,7 +5287,7 @@
               <w:rPr>
                 <w:sz w:val="19"/>
               </w:rPr>
-              <w:t>Apresenta os requisitos, o diagrama e o fluxo técnico antes das análises</w:t>
+              <w:t>Apresenta os requisitos, o diagrama e o fluxo técnico, no final da página, depois das análises</w:t>
             </w:r>
           </w:p>
         </w:tc>
@@ -5742,7 +5742,7 @@
               <w:rPr>
                 <w:sz w:val="19"/>
               </w:rPr>
-              <w:t>Desenha a seção Calor e internações; usa barras_agrupadas (Altair) nos dois gráficos de barras</w:t>
+              <w:t>Desenha a seção Calor e internações; usa dados_barras e barras_agrupadas (Altair) nos dois gráficos de barras, com o intervalo de 95% em cada barra</w:t>
             </w:r>
           </w:p>
         </w:tc>
@@ -5777,6 +5777,71 @@
               <w:rPr>
                 <w:sz w:val="19"/>
               </w:rPr>
+              <w:t>grafico_linhas</w:t>
+            </w:r>
+          </w:p>
+        </w:tc>
+        <w:tc>
+          <w:tcPr>
+            <w:tcW w:type="dxa" w:w="7087"/>
+            <w:vAlign w:val="center"/>
+            <w:tcBorders>
+              <w:top w:val="single" w:sz="4" w:color="D9D9D9"/>
+              <w:left w:val="single" w:sz="4" w:color="D9D9D9"/>
+              <w:bottom w:val="single" w:sz="4" w:color="D9D9D9"/>
+              <w:right w:val="single" w:sz="4" w:color="D9D9D9"/>
+            </w:tcBorders>
+            <w:shd w:fill="FFFFFF"/>
+            <w:tcMar>
+              <w:top w:w="90" w:type="dxa"/>
+              <w:left w:w="90" w:type="dxa"/>
+              <w:bottom w:w="90" w:type="dxa"/>
+              <w:right w:w="90" w:type="dxa"/>
+            </w:tcMar>
+          </w:tcPr>
+          <w:p>
+            <w:pPr>
+              <w:spacing w:after="40" w:line="252" w:lineRule="auto"/>
+            </w:pPr>
+            <w:r>
+              <w:rPr>
+                <w:sz w:val="19"/>
+              </w:rPr>
+              <w:t>Desenha as linhas de temperatura ao longo do tempo e da noite com os meses em português (Altair)</w:t>
+            </w:r>
+          </w:p>
+        </w:tc>
+      </w:tr>
+      <w:tr>
+        <w:trPr>
+          <w:cantSplit/>
+        </w:trPr>
+        <w:tc>
+          <w:tcPr>
+            <w:tcW w:type="dxa" w:w="2551"/>
+            <w:vAlign w:val="center"/>
+            <w:tcBorders>
+              <w:top w:val="single" w:sz="4" w:color="D9D9D9"/>
+              <w:left w:val="single" w:sz="4" w:color="D9D9D9"/>
+              <w:bottom w:val="single" w:sz="4" w:color="D9D9D9"/>
+              <w:right w:val="single" w:sz="4" w:color="D9D9D9"/>
+            </w:tcBorders>
+            <w:shd w:fill="F0F4F7"/>
+            <w:tcMar>
+              <w:top w:w="90" w:type="dxa"/>
+              <w:left w:w="90" w:type="dxa"/>
+              <w:bottom w:w="90" w:type="dxa"/>
+              <w:right w:w="90" w:type="dxa"/>
+            </w:tcMar>
+          </w:tcPr>
+          <w:p>
+            <w:pPr>
+              <w:spacing w:after="40" w:line="252" w:lineRule="auto"/>
+            </w:pPr>
+            <w:r>
+              <w:rPr>
+                <w:sz w:val="19"/>
+              </w:rPr>
               <w:t>mostrar_conclusoes</w:t>
             </w:r>
           </w:p>
@@ -5791,7 +5856,7 @@
               <w:bottom w:val="single" w:sz="4" w:color="D9D9D9"/>
               <w:right w:val="single" w:sz="4" w:color="D9D9D9"/>
             </w:tcBorders>
-            <w:shd w:fill="FFFFFF"/>
+            <w:shd w:fill="F0F4F7"/>
             <w:tcMar>
               <w:top w:w="90" w:type="dxa"/>
               <w:left w:w="90" w:type="dxa"/>
@@ -5826,7 +5891,7 @@
               <w:bottom w:val="single" w:sz="4" w:color="D9D9D9"/>
               <w:right w:val="single" w:sz="4" w:color="D9D9D9"/>
             </w:tcBorders>
-            <w:shd w:fill="F0F4F7"/>
+            <w:shd w:fill="FFFFFF"/>
             <w:tcMar>
               <w:top w:w="90" w:type="dxa"/>
               <w:left w:w="90" w:type="dxa"/>
@@ -5856,7 +5921,7 @@
               <w:bottom w:val="single" w:sz="4" w:color="D9D9D9"/>
               <w:right w:val="single" w:sz="4" w:color="D9D9D9"/>
             </w:tcBorders>
-            <w:shd w:fill="F0F4F7"/>
+            <w:shd w:fill="FFFFFF"/>
             <w:tcMar>
               <w:top w:w="90" w:type="dxa"/>
               <w:left w:w="90" w:type="dxa"/>
@@ -7616,7 +7681,7 @@
               <w:rPr>
                 <w:sz w:val="19"/>
               </w:rPr>
-              <w:t>iniciar_base, carregar_online, recortar_base, mostrar_arquitetura, mostrar_fontes, mostrar_controles, mostrar_exposicao, mostrar_rotina, mostrar_persistencia, carregar_saude, mostrar_saude, barras_agrupadas, mostrar_conclusoes, mostrar_glossario, main</w:t>
+              <w:t>iniciar_base, carregar_online, recortar_base, mostrar_arquitetura, mostrar_fontes, mostrar_controles, mostrar_exposicao, mostrar_rotina, mostrar_persistencia, carregar_saude, mostrar_saude, dados_barras, barras_agrupadas, grafico_linhas, mostrar_conclusoes, mostrar_glossario, main</w:t>
             </w:r>
           </w:p>
         </w:tc>

</xml_diff>